<commit_message>
Atualização na Classe PericulosidadeServices
</commit_message>
<xml_diff>
--- a/ApiWeb/Modelos/ESQUELETO.docx
+++ b/ApiWeb/Modelos/ESQUELETO.docx
@@ -35,6 +35,7 @@
             <w:pPr>
               <w:pStyle w:val="Normal"/>
               <w:widowControl/>
+              <w:suppressAutoHyphens w:val="true"/>
               <w:spacing w:lineRule="auto" w:line="240" w:before="0" w:after="0"/>
               <w:jc w:val="center"/>
               <w:rPr>
@@ -60,6 +61,7 @@
             <w:pPr>
               <w:pStyle w:val="Normal"/>
               <w:widowControl/>
+              <w:suppressAutoHyphens w:val="true"/>
               <w:spacing w:lineRule="auto" w:line="240" w:before="0" w:after="0"/>
               <w:jc w:val="center"/>
               <w:rPr>
@@ -90,6 +92,7 @@
             <w:pPr>
               <w:pStyle w:val="Normal"/>
               <w:widowControl/>
+              <w:suppressAutoHyphens w:val="true"/>
               <w:spacing w:lineRule="auto" w:line="240" w:before="0" w:after="0"/>
               <w:jc w:val="center"/>
               <w:rPr>
@@ -115,6 +118,7 @@
             <w:pPr>
               <w:pStyle w:val="Normal"/>
               <w:widowControl/>
+              <w:suppressAutoHyphens w:val="true"/>
               <w:spacing w:lineRule="auto" w:line="240" w:before="0" w:after="0"/>
               <w:jc w:val="center"/>
               <w:rPr>
@@ -145,6 +149,7 @@
             <w:pPr>
               <w:pStyle w:val="Normal"/>
               <w:widowControl/>
+              <w:suppressAutoHyphens w:val="true"/>
               <w:spacing w:lineRule="auto" w:line="240" w:before="0" w:after="0"/>
               <w:jc w:val="left"/>
               <w:rPr>
@@ -218,23 +223,7 @@
           <w:b/>
           <w:bCs/>
         </w:rPr>
-        <w:t>P</w:t>
-      </w:r>
-      <w:r>
-        <w:rPr>
-          <w:rFonts w:cs="Arial" w:ascii="Arial" w:hAnsi="Arial"/>
-          <w:b/>
-          <w:bCs/>
-        </w:rPr>
-        <w:t>R</w:t>
-      </w:r>
-      <w:r>
-        <w:rPr>
-          <w:rFonts w:cs="Arial" w:ascii="Arial" w:hAnsi="Arial"/>
-          <w:b/>
-          <w:bCs/>
-        </w:rPr>
-        <w:t>OCESSO:</w:t>
+        <w:t>PROCESSO:</w:t>
       </w:r>
       <w:r>
         <w:rPr>
@@ -268,13 +257,7 @@
           <w:b/>
           <w:bCs/>
         </w:rPr>
-        <w:t>AUTOR: {{Reclamantes}}</w:t>
-      </w:r>
-      <w:r>
-        <w:rPr>
-          <w:rFonts w:cs="Arial" w:ascii="Arial" w:hAnsi="Arial"/>
-        </w:rPr>
-        <w:t xml:space="preserve"> </w:t>
+        <w:t xml:space="preserve">AUTOR: {{Reclamantes}} </w:t>
       </w:r>
     </w:p>
     <w:p>
@@ -363,7 +346,7 @@
           <w:rFonts w:cs="Arial"/>
           <w:sz w:val="22"/>
         </w:rPr>
-        <w:t xml:space="preserve">”, encaminha a Vossa Excelência o respectivo laudo pericial e valor de honorários periciais. O presente documento é resultado do trabalho técnico realizado por este perito nas dependências da </w:t>
+        <w:t>”, encaminha a Vossa Excelência o respectivo laudo pericial e valor de honorários periciais. O presente documento é resultado do trabalho técnico realizado por este perito nas dependências da #</w:t>
       </w:r>
       <w:r>
         <w:rPr>
@@ -372,7 +355,7 @@
           <w:bCs/>
           <w:sz w:val="22"/>
         </w:rPr>
-        <w:t>{{Reclamada}}</w:t>
+        <w:t>Reclamadas</w:t>
       </w:r>
       <w:r>
         <w:rPr>
@@ -404,7 +387,25 @@
           <w:bCs/>
           <w:sz w:val="22"/>
         </w:rPr>
-        <w:t xml:space="preserve">{{RUA}}, {{Numero}}, </w:t>
+        <w:t>{{RUA}}, {{N</w:t>
+      </w:r>
+      <w:r>
+        <w:rPr>
+          <w:rFonts w:cs="Arial"/>
+          <w:b/>
+          <w:bCs/>
+          <w:sz w:val="22"/>
+        </w:rPr>
+        <w:t>UMERO</w:t>
+      </w:r>
+      <w:r>
+        <w:rPr>
+          <w:rFonts w:cs="Arial"/>
+          <w:b/>
+          <w:bCs/>
+          <w:sz w:val="22"/>
+        </w:rPr>
+        <w:t xml:space="preserve">}}, </w:t>
       </w:r>
       <w:r>
         <w:rPr>
@@ -673,6 +674,7 @@
             <w:pPr>
               <w:pStyle w:val="Normal"/>
               <w:widowControl/>
+              <w:suppressAutoHyphens w:val="true"/>
               <w:spacing w:lineRule="auto" w:line="240" w:before="0" w:after="0"/>
               <w:jc w:val="center"/>
               <w:rPr>
@@ -697,6 +699,7 @@
             <w:pPr>
               <w:pStyle w:val="Normal"/>
               <w:widowControl/>
+              <w:suppressAutoHyphens w:val="true"/>
               <w:spacing w:lineRule="auto" w:line="240" w:before="0" w:after="0"/>
               <w:jc w:val="center"/>
               <w:rPr>
@@ -727,6 +730,7 @@
             <w:pPr>
               <w:pStyle w:val="Normal"/>
               <w:widowControl/>
+              <w:suppressAutoHyphens w:val="true"/>
               <w:spacing w:lineRule="auto" w:line="240" w:before="0" w:after="0"/>
               <w:jc w:val="center"/>
               <w:rPr>
@@ -751,6 +755,7 @@
             <w:pPr>
               <w:pStyle w:val="Normal"/>
               <w:widowControl/>
+              <w:suppressAutoHyphens w:val="true"/>
               <w:spacing w:lineRule="auto" w:line="240" w:before="0" w:after="0"/>
               <w:jc w:val="center"/>
               <w:rPr>
@@ -781,6 +786,7 @@
             <w:pPr>
               <w:pStyle w:val="Normal"/>
               <w:widowControl/>
+              <w:suppressAutoHyphens w:val="true"/>
               <w:spacing w:lineRule="auto" w:line="240" w:before="0" w:after="0"/>
               <w:jc w:val="left"/>
               <w:rPr>
@@ -1072,6 +1078,7 @@
             <w:pPr>
               <w:pStyle w:val="Normal"/>
               <w:widowControl/>
+              <w:suppressAutoHyphens w:val="true"/>
               <w:spacing w:lineRule="auto" w:line="240" w:before="0" w:after="0"/>
               <w:jc w:val="center"/>
               <w:rPr>
@@ -1096,6 +1103,7 @@
             <w:pPr>
               <w:pStyle w:val="Normal"/>
               <w:widowControl/>
+              <w:suppressAutoHyphens w:val="true"/>
               <w:spacing w:lineRule="auto" w:line="240" w:before="0" w:after="0"/>
               <w:jc w:val="center"/>
               <w:rPr>
@@ -1126,6 +1134,7 @@
             <w:pPr>
               <w:pStyle w:val="Normal"/>
               <w:widowControl/>
+              <w:suppressAutoHyphens w:val="true"/>
               <w:spacing w:lineRule="auto" w:line="240" w:before="0" w:after="0"/>
               <w:jc w:val="center"/>
               <w:rPr>
@@ -1150,6 +1159,7 @@
             <w:pPr>
               <w:pStyle w:val="Normal"/>
               <w:widowControl/>
+              <w:suppressAutoHyphens w:val="true"/>
               <w:spacing w:lineRule="auto" w:line="240" w:before="0" w:after="0"/>
               <w:jc w:val="center"/>
               <w:rPr>
@@ -1180,6 +1190,7 @@
             <w:pPr>
               <w:pStyle w:val="Normal"/>
               <w:widowControl/>
+              <w:suppressAutoHyphens w:val="true"/>
               <w:spacing w:lineRule="auto" w:line="240" w:before="0" w:after="0"/>
               <w:jc w:val="left"/>
               <w:rPr>
@@ -1720,6 +1731,7 @@
             <w:pPr>
               <w:pStyle w:val="Normal"/>
               <w:widowControl/>
+              <w:suppressAutoHyphens w:val="true"/>
               <w:spacing w:lineRule="auto" w:line="240" w:before="0" w:after="0"/>
               <w:jc w:val="center"/>
               <w:rPr>
@@ -1744,6 +1756,7 @@
             <w:pPr>
               <w:pStyle w:val="Normal"/>
               <w:widowControl/>
+              <w:suppressAutoHyphens w:val="true"/>
               <w:spacing w:lineRule="auto" w:line="240" w:before="0" w:after="0"/>
               <w:jc w:val="center"/>
               <w:rPr>
@@ -1774,6 +1787,7 @@
             <w:pPr>
               <w:pStyle w:val="Normal"/>
               <w:widowControl/>
+              <w:suppressAutoHyphens w:val="true"/>
               <w:spacing w:lineRule="auto" w:line="240" w:before="0" w:after="0"/>
               <w:jc w:val="center"/>
               <w:rPr>
@@ -1798,6 +1812,7 @@
             <w:pPr>
               <w:pStyle w:val="Normal"/>
               <w:widowControl/>
+              <w:suppressAutoHyphens w:val="true"/>
               <w:spacing w:lineRule="auto" w:line="240" w:before="0" w:after="0"/>
               <w:jc w:val="center"/>
               <w:rPr>
@@ -1828,6 +1843,7 @@
             <w:pPr>
               <w:pStyle w:val="Normal"/>
               <w:widowControl/>
+              <w:suppressAutoHyphens w:val="true"/>
               <w:spacing w:lineRule="auto" w:line="240" w:before="0" w:after="0"/>
               <w:jc w:val="left"/>
               <w:rPr>
@@ -2214,6 +2230,7 @@
             <w:pPr>
               <w:pStyle w:val="meusumrio"/>
               <w:widowControl/>
+              <w:suppressAutoHyphens w:val="true"/>
               <w:spacing w:before="0" w:after="0"/>
               <w:jc w:val="center"/>
               <w:rPr>
@@ -2245,6 +2262,7 @@
             <w:pPr>
               <w:pStyle w:val="meusumrio"/>
               <w:widowControl/>
+              <w:suppressAutoHyphens w:val="true"/>
               <w:spacing w:before="0" w:after="0"/>
               <w:jc w:val="center"/>
               <w:rPr>
@@ -2279,6 +2297,7 @@
             <w:pPr>
               <w:pStyle w:val="meusumrio"/>
               <w:widowControl/>
+              <w:suppressAutoHyphens w:val="true"/>
               <w:spacing w:before="0" w:after="0"/>
               <w:rPr>
                 <w:sz w:val="28"/>
@@ -2287,11 +2306,8 @@
             </w:pPr>
             <w:r>
               <w:rPr>
-                <w:rFonts w:eastAsia="Aptos"/>
-                <w:kern w:val="2"/>
                 <w:sz w:val="28"/>
                 <w:szCs w:val="28"/>
-                <w:lang w:val="pt-BR" w:eastAsia="en-US" w:bidi="ar-SA"/>
               </w:rPr>
             </w:r>
           </w:p>
@@ -2305,6 +2321,7 @@
             <w:pPr>
               <w:pStyle w:val="meusumrio"/>
               <w:widowControl/>
+              <w:suppressAutoHyphens w:val="true"/>
               <w:spacing w:before="0" w:after="0"/>
               <w:rPr>
                 <w:sz w:val="28"/>
@@ -2313,11 +2330,8 @@
             </w:pPr>
             <w:r>
               <w:rPr>
-                <w:rFonts w:eastAsia="Aptos"/>
-                <w:kern w:val="2"/>
                 <w:sz w:val="28"/>
                 <w:szCs w:val="28"/>
-                <w:lang w:val="pt-BR" w:eastAsia="en-US" w:bidi="ar-SA"/>
               </w:rPr>
             </w:r>
           </w:p>
@@ -2334,6 +2348,7 @@
             <w:pPr>
               <w:pStyle w:val="meusumrio"/>
               <w:widowControl/>
+              <w:suppressAutoHyphens w:val="true"/>
               <w:spacing w:before="0" w:after="0"/>
               <w:rPr>
                 <w:sz w:val="28"/>
@@ -2342,11 +2357,8 @@
             </w:pPr>
             <w:r>
               <w:rPr>
-                <w:rFonts w:eastAsia="Aptos"/>
-                <w:kern w:val="2"/>
                 <w:sz w:val="28"/>
                 <w:szCs w:val="28"/>
-                <w:lang w:val="pt-BR" w:eastAsia="en-US" w:bidi="ar-SA"/>
               </w:rPr>
             </w:r>
           </w:p>
@@ -2360,6 +2372,7 @@
             <w:pPr>
               <w:pStyle w:val="meusumrio"/>
               <w:widowControl/>
+              <w:suppressAutoHyphens w:val="true"/>
               <w:spacing w:before="0" w:after="0"/>
               <w:rPr>
                 <w:sz w:val="28"/>
@@ -2368,11 +2381,8 @@
             </w:pPr>
             <w:r>
               <w:rPr>
-                <w:rFonts w:eastAsia="Aptos"/>
-                <w:kern w:val="2"/>
                 <w:sz w:val="28"/>
                 <w:szCs w:val="28"/>
-                <w:lang w:val="pt-BR" w:eastAsia="en-US" w:bidi="ar-SA"/>
               </w:rPr>
             </w:r>
           </w:p>
@@ -2488,6 +2498,7 @@
             <w:pPr>
               <w:pStyle w:val="Normal"/>
               <w:widowControl/>
+              <w:suppressAutoHyphens w:val="true"/>
               <w:spacing w:lineRule="auto" w:line="240" w:before="0" w:after="0"/>
               <w:jc w:val="center"/>
               <w:rPr>
@@ -2512,6 +2523,7 @@
             <w:pPr>
               <w:pStyle w:val="Normal"/>
               <w:widowControl/>
+              <w:suppressAutoHyphens w:val="true"/>
               <w:spacing w:lineRule="auto" w:line="240" w:before="0" w:after="0"/>
               <w:jc w:val="center"/>
               <w:rPr>
@@ -2542,6 +2554,7 @@
             <w:pPr>
               <w:pStyle w:val="Normal"/>
               <w:widowControl/>
+              <w:suppressAutoHyphens w:val="true"/>
               <w:spacing w:lineRule="auto" w:line="240" w:before="0" w:after="0"/>
               <w:jc w:val="center"/>
               <w:rPr>
@@ -2566,6 +2579,7 @@
             <w:pPr>
               <w:pStyle w:val="Normal"/>
               <w:widowControl/>
+              <w:suppressAutoHyphens w:val="true"/>
               <w:spacing w:lineRule="auto" w:line="240" w:before="0" w:after="0"/>
               <w:jc w:val="center"/>
               <w:rPr>
@@ -2596,6 +2610,7 @@
             <w:pPr>
               <w:pStyle w:val="Normal"/>
               <w:widowControl/>
+              <w:suppressAutoHyphens w:val="true"/>
               <w:spacing w:lineRule="auto" w:line="240" w:before="0" w:after="0"/>
               <w:jc w:val="left"/>
               <w:rPr>
@@ -3161,6 +3176,7 @@
               <w:pStyle w:val="Normal"/>
               <w:pageBreakBefore/>
               <w:widowControl/>
+              <w:suppressAutoHyphens w:val="true"/>
               <w:spacing w:lineRule="auto" w:line="240" w:before="0" w:after="0"/>
               <w:jc w:val="center"/>
               <w:rPr>
@@ -3185,6 +3201,7 @@
             <w:pPr>
               <w:pStyle w:val="Normal"/>
               <w:widowControl/>
+              <w:suppressAutoHyphens w:val="true"/>
               <w:spacing w:lineRule="auto" w:line="240" w:before="0" w:after="0"/>
               <w:jc w:val="center"/>
               <w:rPr>
@@ -3215,6 +3232,7 @@
             <w:pPr>
               <w:pStyle w:val="Normal"/>
               <w:widowControl/>
+              <w:suppressAutoHyphens w:val="true"/>
               <w:spacing w:lineRule="auto" w:line="240" w:before="0" w:after="0"/>
               <w:jc w:val="center"/>
               <w:rPr>
@@ -3239,6 +3257,7 @@
             <w:pPr>
               <w:pStyle w:val="Normal"/>
               <w:widowControl/>
+              <w:suppressAutoHyphens w:val="true"/>
               <w:spacing w:lineRule="auto" w:line="240" w:before="0" w:after="0"/>
               <w:jc w:val="center"/>
               <w:rPr>
@@ -3269,6 +3288,7 @@
             <w:pPr>
               <w:pStyle w:val="Normal"/>
               <w:widowControl/>
+              <w:suppressAutoHyphens w:val="true"/>
               <w:spacing w:lineRule="auto" w:line="240" w:before="0" w:after="0"/>
               <w:jc w:val="left"/>
               <w:rPr>
@@ -4414,6 +4434,7 @@
     <w:qFormat/>
     <w:pPr>
       <w:widowControl/>
+      <w:suppressAutoHyphens w:val="true"/>
       <w:bidi w:val="0"/>
       <w:spacing w:lineRule="auto" w:line="276" w:before="0" w:after="160"/>
       <w:jc w:val="left"/>
@@ -5050,6 +5071,7 @@
     <w:rsid w:val="00ea1e2e"/>
     <w:pPr>
       <w:widowControl/>
+      <w:suppressAutoHyphens w:val="true"/>
       <w:bidi w:val="0"/>
       <w:spacing w:lineRule="auto" w:line="240" w:before="0" w:after="0"/>
       <w:jc w:val="left"/>

</xml_diff>

<commit_message>
Add ler e copiar documentos de anexos
</commit_message>
<xml_diff>
--- a/ApiWeb/Modelos/ESQUELETO.docx
+++ b/ApiWeb/Modelos/ESQUELETO.docx
@@ -387,25 +387,7 @@
           <w:bCs/>
           <w:sz w:val="22"/>
         </w:rPr>
-        <w:t>{{RUA}}, {{N</w:t>
-      </w:r>
-      <w:r>
-        <w:rPr>
-          <w:rFonts w:cs="Arial"/>
-          <w:b/>
-          <w:bCs/>
-          <w:sz w:val="22"/>
-        </w:rPr>
-        <w:t>UMERO</w:t>
-      </w:r>
-      <w:r>
-        <w:rPr>
-          <w:rFonts w:cs="Arial"/>
-          <w:b/>
-          <w:bCs/>
-          <w:sz w:val="22"/>
-        </w:rPr>
-        <w:t xml:space="preserve">}}, </w:t>
+        <w:t xml:space="preserve">{{RUA}}, {{NUMERO}}, </w:t>
       </w:r>
       <w:r>
         <w:rPr>
@@ -548,7 +530,27 @@
           <w:sz w:val="22"/>
           <w:szCs w:val="22"/>
         </w:rPr>
-        <w:t>{{CIDADE}}, {{DATA}}</w:t>
+        <w:t>{{CIDADE}}, {{DATA</w:t>
+      </w:r>
+      <w:r>
+        <w:rPr>
+          <w:rFonts w:cs="Arial" w:ascii="Arial" w:hAnsi="Arial"/>
+          <w:b/>
+          <w:bCs/>
+          <w:sz w:val="22"/>
+          <w:szCs w:val="22"/>
+        </w:rPr>
+        <w:t>LAUDO</w:t>
+      </w:r>
+      <w:r>
+        <w:rPr>
+          <w:rFonts w:cs="Arial" w:ascii="Arial" w:hAnsi="Arial"/>
+          <w:b/>
+          <w:bCs/>
+          <w:sz w:val="22"/>
+          <w:szCs w:val="22"/>
+        </w:rPr>
+        <w:t>}}</w:t>
       </w:r>
     </w:p>
     <w:p>

</xml_diff>

<commit_message>
mudei o services para um dictionary de acoes
</commit_message>
<xml_diff>
--- a/ApiWeb/Modelos/ESQUELETO.docx
+++ b/ApiWeb/Modelos/ESQUELETO.docx
@@ -79,7 +79,7 @@
                 <w:szCs w:val="24"/>
                 <w:lang w:val="pt-BR" w:eastAsia="en-US" w:bidi="ar-SA"/>
               </w:rPr>
-              <w:t>#NumeroPericia</w:t>
+              <w:t>{{NumeroPericia}}</w:t>
             </w:r>
           </w:p>
         </w:tc>
@@ -229,7 +229,7 @@
         <w:rPr>
           <w:rFonts w:cs="Arial" w:ascii="Arial" w:hAnsi="Arial"/>
         </w:rPr>
-        <w:t xml:space="preserve"> </w:t>
+        <w:t xml:space="preserve"> {{</w:t>
       </w:r>
       <w:r>
         <w:rPr>
@@ -241,7 +241,19 @@
           <w:szCs w:val="24"/>
           <w:lang w:val="pt-BR" w:eastAsia="en-US" w:bidi="ar-SA"/>
         </w:rPr>
-        <w:t>#NumeroPericia</w:t>
+        <w:t>NumeroPericia</w:t>
+      </w:r>
+      <w:r>
+        <w:rPr>
+          <w:rFonts w:eastAsia="Aptos" w:cs="Arial" w:ascii="Arial" w:hAnsi="Arial"/>
+          <w:b w:val="false"/>
+          <w:bCs w:val="false"/>
+          <w:kern w:val="2"/>
+          <w:sz w:val="24"/>
+          <w:szCs w:val="24"/>
+          <w:lang w:val="pt-BR" w:eastAsia="en-US" w:bidi="ar-SA"/>
+        </w:rPr>
+        <w:t>}}</w:t>
       </w:r>
     </w:p>
     <w:p>
@@ -530,27 +542,7 @@
           <w:sz w:val="22"/>
           <w:szCs w:val="22"/>
         </w:rPr>
-        <w:t>{{CIDADE}}, {{DATA</w:t>
-      </w:r>
-      <w:r>
-        <w:rPr>
-          <w:rFonts w:cs="Arial" w:ascii="Arial" w:hAnsi="Arial"/>
-          <w:b/>
-          <w:bCs/>
-          <w:sz w:val="22"/>
-          <w:szCs w:val="22"/>
-        </w:rPr>
-        <w:t>LAUDO</w:t>
-      </w:r>
-      <w:r>
-        <w:rPr>
-          <w:rFonts w:cs="Arial" w:ascii="Arial" w:hAnsi="Arial"/>
-          <w:b/>
-          <w:bCs/>
-          <w:sz w:val="22"/>
-          <w:szCs w:val="22"/>
-        </w:rPr>
-        <w:t>}}</w:t>
+        <w:t>{{CIDADE}}, {{DATALAUDO}}</w:t>
       </w:r>
     </w:p>
     <w:p>
@@ -1375,7 +1367,7 @@
           <w:sz w:val="22"/>
           <w:szCs w:val="22"/>
         </w:rPr>
-        <w:t>{{Reclamantes}}</w:t>
+        <w:t xml:space="preserve">{{Reclamantes}} </w:t>
       </w:r>
     </w:p>
     <w:p>
@@ -1437,7 +1429,27 @@
           <w:sz w:val="22"/>
           <w:szCs w:val="22"/>
         </w:rPr>
-        <w:t>OBJETO DA PERÍCIA: {{TipoDoLaudo}}</w:t>
+        <w:t>OBJETO DA PERÍCIA: {{</w:t>
+      </w:r>
+      <w:r>
+        <w:rPr>
+          <w:rFonts w:cs="Arial" w:ascii="Arial" w:hAnsi="Arial"/>
+          <w:b/>
+          <w:bCs/>
+          <w:sz w:val="22"/>
+          <w:szCs w:val="22"/>
+        </w:rPr>
+        <w:t>Objetivo</w:t>
+      </w:r>
+      <w:r>
+        <w:rPr>
+          <w:rFonts w:cs="Arial" w:ascii="Arial" w:hAnsi="Arial"/>
+          <w:b/>
+          <w:bCs/>
+          <w:sz w:val="22"/>
+          <w:szCs w:val="22"/>
+        </w:rPr>
+        <w:t>}}</w:t>
       </w:r>
     </w:p>
     <w:p>

</xml_diff>

<commit_message>
falta resolver presentes e horas
</commit_message>
<xml_diff>
--- a/ApiWeb/Modelos/ESQUELETO.docx
+++ b/ApiWeb/Modelos/ESQUELETO.docx
@@ -2,177 +2,6 @@
 <file path=word/document.xml><?xml version="1.0" encoding="utf-8"?>
 <w:document xmlns:o="urn:schemas-microsoft-com:office:office" xmlns:r="http://schemas.openxmlformats.org/officeDocument/2006/relationships" xmlns:v="urn:schemas-microsoft-com:vml" xmlns:w="http://schemas.openxmlformats.org/wordprocessingml/2006/main" xmlns:w10="urn:schemas-microsoft-com:office:word" xmlns:wp="http://schemas.openxmlformats.org/drawingml/2006/wordprocessingDrawing" xmlns:wps="http://schemas.microsoft.com/office/word/2010/wordprocessingShape" xmlns:wpg="http://schemas.microsoft.com/office/word/2010/wordprocessingGroup" xmlns:mc="http://schemas.openxmlformats.org/markup-compatibility/2006" xmlns:wp14="http://schemas.microsoft.com/office/word/2010/wordprocessingDrawing" xmlns:w14="http://schemas.microsoft.com/office/word/2010/wordml" xmlns:w15="http://schemas.microsoft.com/office/word/2012/wordml" mc:Ignorable="w14 wp14 w15">
   <w:body>
-    <w:tbl>
-      <w:tblPr>
-        <w:tblStyle w:val="Tabelacomgrade"/>
-        <w:tblW w:w="8494" w:type="dxa"/>
-        <w:jc w:val="center"/>
-        <w:tblInd w:w="0" w:type="dxa"/>
-        <w:tblLayout w:type="fixed"/>
-        <w:tblCellMar>
-          <w:top w:w="0" w:type="dxa"/>
-          <w:left w:w="108" w:type="dxa"/>
-          <w:bottom w:w="0" w:type="dxa"/>
-          <w:right w:w="108" w:type="dxa"/>
-        </w:tblCellMar>
-        <w:tblLook w:val="04a0" w:noHBand="0" w:noVBand="1" w:firstColumn="1" w:lastRow="0" w:lastColumn="0" w:firstRow="1"/>
-      </w:tblPr>
-      <w:tblGrid>
-        <w:gridCol w:w="2831"/>
-        <w:gridCol w:w="2831"/>
-        <w:gridCol w:w="2832"/>
-      </w:tblGrid>
-      <w:tr>
-        <w:trPr>
-          <w:trHeight w:val="557" w:hRule="atLeast"/>
-        </w:trPr>
-        <w:tc>
-          <w:tcPr>
-            <w:tcW w:w="2831" w:type="dxa"/>
-            <w:tcBorders/>
-          </w:tcPr>
-          <w:p>
-            <w:pPr>
-              <w:pStyle w:val="Normal"/>
-              <w:widowControl/>
-              <w:suppressAutoHyphens w:val="true"/>
-              <w:spacing w:lineRule="auto" w:line="240" w:before="0" w:after="0"/>
-              <w:jc w:val="center"/>
-              <w:rPr>
-                <w:rFonts w:ascii="Arial" w:hAnsi="Arial" w:cs="Arial"/>
-                <w:b/>
-                <w:bCs/>
-              </w:rPr>
-            </w:pPr>
-            <w:r>
-              <w:rPr>
-                <w:rFonts w:eastAsia="Aptos" w:cs="Arial" w:ascii="Arial" w:hAnsi="Arial"/>
-                <w:b/>
-                <w:bCs/>
-                <w:kern w:val="2"/>
-                <w:sz w:val="24"/>
-                <w:szCs w:val="24"/>
-                <w:lang w:val="pt-BR" w:eastAsia="en-US" w:bidi="ar-SA"/>
-              </w:rPr>
-              <w:t>PROCESSO</w:t>
-            </w:r>
-          </w:p>
-          <w:p>
-            <w:pPr>
-              <w:pStyle w:val="Normal"/>
-              <w:widowControl/>
-              <w:suppressAutoHyphens w:val="true"/>
-              <w:spacing w:lineRule="auto" w:line="240" w:before="0" w:after="0"/>
-              <w:jc w:val="center"/>
-              <w:rPr>
-                <w:b/>
-                <w:bCs/>
-              </w:rPr>
-            </w:pPr>
-            <w:r>
-              <w:rPr>
-                <w:rFonts w:eastAsia="Aptos" w:cs="Arial" w:ascii="Arial" w:hAnsi="Arial"/>
-                <w:b/>
-                <w:bCs/>
-                <w:kern w:val="2"/>
-                <w:sz w:val="24"/>
-                <w:szCs w:val="24"/>
-                <w:lang w:val="pt-BR" w:eastAsia="en-US" w:bidi="ar-SA"/>
-              </w:rPr>
-              <w:t>{{NumeroPericia}}</w:t>
-            </w:r>
-          </w:p>
-        </w:tc>
-        <w:tc>
-          <w:tcPr>
-            <w:tcW w:w="2831" w:type="dxa"/>
-            <w:tcBorders/>
-          </w:tcPr>
-          <w:p>
-            <w:pPr>
-              <w:pStyle w:val="Normal"/>
-              <w:widowControl/>
-              <w:suppressAutoHyphens w:val="true"/>
-              <w:spacing w:lineRule="auto" w:line="240" w:before="0" w:after="0"/>
-              <w:jc w:val="center"/>
-              <w:rPr>
-                <w:rFonts w:ascii="Arial" w:hAnsi="Arial" w:cs="Arial"/>
-                <w:b/>
-                <w:bCs/>
-              </w:rPr>
-            </w:pPr>
-            <w:r>
-              <w:rPr>
-                <w:rFonts w:eastAsia="Aptos" w:cs="Arial" w:ascii="Arial" w:hAnsi="Arial"/>
-                <w:b/>
-                <w:bCs/>
-                <w:kern w:val="2"/>
-                <w:sz w:val="24"/>
-                <w:szCs w:val="24"/>
-                <w:lang w:val="pt-BR" w:eastAsia="en-US" w:bidi="ar-SA"/>
-              </w:rPr>
-              <w:t>Notificação</w:t>
-            </w:r>
-          </w:p>
-          <w:p>
-            <w:pPr>
-              <w:pStyle w:val="Normal"/>
-              <w:widowControl/>
-              <w:suppressAutoHyphens w:val="true"/>
-              <w:spacing w:lineRule="auto" w:line="240" w:before="0" w:after="0"/>
-              <w:jc w:val="center"/>
-              <w:rPr>
-                <w:b/>
-                <w:bCs/>
-              </w:rPr>
-            </w:pPr>
-            <w:r>
-              <w:rPr>
-                <w:rFonts w:eastAsia="Aptos" w:cs="Arial" w:ascii="Arial" w:hAnsi="Arial"/>
-                <w:b/>
-                <w:bCs/>
-                <w:kern w:val="2"/>
-                <w:sz w:val="24"/>
-                <w:szCs w:val="24"/>
-                <w:lang w:val="pt-BR" w:eastAsia="en-US" w:bidi="ar-SA"/>
-              </w:rPr>
-              <w:t>Realização de Perícia Técnica</w:t>
-            </w:r>
-          </w:p>
-        </w:tc>
-        <w:tc>
-          <w:tcPr>
-            <w:tcW w:w="2832" w:type="dxa"/>
-            <w:tcBorders/>
-          </w:tcPr>
-          <w:p>
-            <w:pPr>
-              <w:pStyle w:val="Normal"/>
-              <w:widowControl/>
-              <w:suppressAutoHyphens w:val="true"/>
-              <w:spacing w:lineRule="auto" w:line="240" w:before="0" w:after="0"/>
-              <w:jc w:val="left"/>
-              <w:rPr>
-                <w:rFonts w:ascii="Aptos" w:hAnsi="Aptos" w:eastAsia="Aptos" w:cs=""/>
-                <w:kern w:val="2"/>
-                <w:sz w:val="24"/>
-                <w:szCs w:val="24"/>
-                <w:lang w:val="pt-BR" w:eastAsia="en-US" w:bidi="ar-SA"/>
-              </w:rPr>
-            </w:pPr>
-            <w:r>
-              <w:rPr>
-                <w:rFonts w:eastAsia="Aptos" w:cs=""/>
-                <w:kern w:val="2"/>
-                <w:sz w:val="24"/>
-                <w:szCs w:val="24"/>
-                <w:lang w:val="pt-BR" w:eastAsia="en-US" w:bidi="ar-SA"/>
-              </w:rPr>
-            </w:r>
-          </w:p>
-        </w:tc>
-      </w:tr>
-    </w:tbl>
     <w:p>
       <w:pPr>
         <w:pStyle w:val="Normal"/>
@@ -229,19 +58,15 @@
         <w:rPr>
           <w:rFonts w:cs="Arial" w:ascii="Arial" w:hAnsi="Arial"/>
         </w:rPr>
-        <w:t xml:space="preserve"> {{</w:t>
-      </w:r>
-      <w:r>
-        <w:rPr>
-          <w:rFonts w:eastAsia="Aptos" w:cs="Arial" w:ascii="Arial" w:hAnsi="Arial"/>
-          <w:b/>
-          <w:bCs/>
-          <w:kern w:val="2"/>
-          <w:sz w:val="24"/>
-          <w:szCs w:val="24"/>
-          <w:lang w:val="pt-BR" w:eastAsia="en-US" w:bidi="ar-SA"/>
-        </w:rPr>
-        <w:t>NumeroPericia</w:t>
+        <w:t xml:space="preserve"> </w:t>
+      </w:r>
+      <w:r>
+        <w:rPr>
+          <w:rFonts w:cs="Arial" w:ascii="Arial" w:hAnsi="Arial"/>
+          <w:b w:val="false"/>
+          <w:bCs w:val="false"/>
+        </w:rPr>
+        <w:t>{{</w:t>
       </w:r>
       <w:r>
         <w:rPr>
@@ -253,7 +78,7 @@
           <w:szCs w:val="24"/>
           <w:lang w:val="pt-BR" w:eastAsia="en-US" w:bidi="ar-SA"/>
         </w:rPr>
-        <w:t>}}</w:t>
+        <w:t>NumeroPericia}}</w:t>
       </w:r>
     </w:p>
     <w:p>
@@ -269,7 +94,15 @@
           <w:b/>
           <w:bCs/>
         </w:rPr>
-        <w:t xml:space="preserve">AUTOR: {{Reclamantes}} </w:t>
+        <w:t xml:space="preserve">AUTOR: </w:t>
+      </w:r>
+      <w:r>
+        <w:rPr>
+          <w:rFonts w:cs="Arial" w:ascii="Arial" w:hAnsi="Arial"/>
+          <w:b w:val="false"/>
+          <w:bCs w:val="false"/>
+        </w:rPr>
+        <w:t xml:space="preserve">{{Reclamantes}} </w:t>
       </w:r>
     </w:p>
     <w:p>
@@ -298,8 +131,8 @@
       <w:r>
         <w:rPr>
           <w:rFonts w:cs="Arial" w:ascii="Arial" w:hAnsi="Arial"/>
-          <w:b/>
-          <w:bCs/>
+          <w:b w:val="false"/>
+          <w:bCs w:val="false"/>
         </w:rPr>
         <w:t>{{Reclamada}}</w:t>
       </w:r>
@@ -358,16 +191,16 @@
           <w:rFonts w:cs="Arial"/>
           <w:sz w:val="22"/>
         </w:rPr>
-        <w:t>”, encaminha a Vossa Excelência o respectivo laudo pericial e valor de honorários periciais. O presente documento é resultado do trabalho técnico realizado por este perito nas dependências da #</w:t>
+        <w:t xml:space="preserve">”, encaminha a Vossa Excelência o respectivo laudo pericial e valor de honorários periciais. O presente documento é resultado do trabalho técnico realizado por este perito nas dependências da </w:t>
       </w:r>
       <w:r>
         <w:rPr>
           <w:rFonts w:cs="Arial"/>
-          <w:b/>
-          <w:bCs/>
-          <w:sz w:val="22"/>
-        </w:rPr>
-        <w:t>Reclamadas</w:t>
+          <w:b w:val="false"/>
+          <w:bCs w:val="false"/>
+          <w:sz w:val="22"/>
+        </w:rPr>
+        <w:t>#Reclamadas</w:t>
       </w:r>
       <w:r>
         <w:rPr>
@@ -395,15 +228,24 @@
       <w:r>
         <w:rPr>
           <w:rFonts w:cs="Arial"/>
-          <w:b/>
-          <w:bCs/>
-          <w:sz w:val="22"/>
-        </w:rPr>
-        <w:t xml:space="preserve">{{RUA}}, {{NUMERO}}, </w:t>
+          <w:b w:val="false"/>
+          <w:bCs w:val="false"/>
+          <w:sz w:val="22"/>
+        </w:rPr>
+        <w:t>{{RUA}}, {{NUMERO}},</w:t>
       </w:r>
       <w:r>
         <w:rPr>
           <w:rFonts w:cs="Arial"/>
+          <w:b/>
+          <w:bCs/>
+          <w:sz w:val="22"/>
+        </w:rPr>
+        <w:t xml:space="preserve"> </w:t>
+      </w:r>
+      <w:r>
+        <w:rPr>
+          <w:rFonts w:cs="Arial"/>
           <w:sz w:val="22"/>
         </w:rPr>
         <w:t>bairro</w:t>
@@ -415,7 +257,16 @@
           <w:bCs/>
           <w:sz w:val="22"/>
         </w:rPr>
-        <w:t xml:space="preserve"> {{BAIRRO}}, {{CIDADE}}</w:t>
+        <w:t xml:space="preserve"> </w:t>
+      </w:r>
+      <w:r>
+        <w:rPr>
+          <w:rFonts w:cs="Arial"/>
+          <w:b w:val="false"/>
+          <w:bCs w:val="false"/>
+          <w:sz w:val="22"/>
+        </w:rPr>
+        <w:t>{{BAIRRO}}, {{CIDADE}}</w:t>
       </w:r>
       <w:r>
         <w:rPr>
@@ -527,18 +378,15 @@
         <w:pStyle w:val="Normal"/>
         <w:spacing w:lineRule="auto" w:line="360"/>
         <w:rPr>
-          <w:rFonts w:ascii="Arial" w:hAnsi="Arial" w:cs="Arial"/>
-          <w:b/>
-          <w:bCs/>
-          <w:sz w:val="22"/>
-          <w:szCs w:val="22"/>
-        </w:rPr>
-      </w:pPr>
-      <w:r>
-        <w:rPr>
-          <w:rFonts w:cs="Arial" w:ascii="Arial" w:hAnsi="Arial"/>
-          <w:b/>
-          <w:bCs/>
+          <w:b w:val="false"/>
+          <w:bCs w:val="false"/>
+        </w:rPr>
+      </w:pPr>
+      <w:r>
+        <w:rPr>
+          <w:rFonts w:cs="Arial" w:ascii="Arial" w:hAnsi="Arial"/>
+          <w:b w:val="false"/>
+          <w:bCs w:val="false"/>
           <w:sz w:val="22"/>
           <w:szCs w:val="22"/>
         </w:rPr>
@@ -622,204 +470,37 @@
         <w:pStyle w:val="Normal"/>
         <w:spacing w:lineRule="auto" w:line="360"/>
         <w:rPr>
-          <w:rFonts w:cs="Arial"/>
-          <w:b/>
-          <w:bCs/>
-        </w:rPr>
-      </w:pPr>
-      <w:r>
-        <w:rPr>
-          <w:rFonts w:cs="Arial"/>
-          <w:b/>
-          <w:bCs/>
-        </w:rPr>
-      </w:r>
-    </w:p>
-    <w:tbl>
-      <w:tblPr>
-        <w:tblStyle w:val="Tabelacomgrade"/>
-        <w:tblW w:w="8494" w:type="dxa"/>
-        <w:jc w:val="center"/>
-        <w:tblInd w:w="0" w:type="dxa"/>
-        <w:tblLayout w:type="fixed"/>
-        <w:tblCellMar>
-          <w:top w:w="0" w:type="dxa"/>
-          <w:left w:w="108" w:type="dxa"/>
-          <w:bottom w:w="0" w:type="dxa"/>
-          <w:right w:w="108" w:type="dxa"/>
-        </w:tblCellMar>
-        <w:tblLook w:val="04a0" w:noHBand="0" w:noVBand="1" w:firstColumn="1" w:lastRow="0" w:lastColumn="0" w:firstRow="1"/>
-      </w:tblPr>
-      <w:tblGrid>
-        <w:gridCol w:w="2831"/>
-        <w:gridCol w:w="2831"/>
-        <w:gridCol w:w="2832"/>
-      </w:tblGrid>
-      <w:tr>
-        <w:trPr>
-          <w:trHeight w:val="557" w:hRule="atLeast"/>
-        </w:trPr>
-        <w:tc>
-          <w:tcPr>
-            <w:tcW w:w="2831" w:type="dxa"/>
-            <w:tcBorders/>
-          </w:tcPr>
-          <w:p>
-            <w:pPr>
-              <w:pStyle w:val="Normal"/>
-              <w:widowControl/>
-              <w:suppressAutoHyphens w:val="true"/>
-              <w:spacing w:lineRule="auto" w:line="240" w:before="0" w:after="0"/>
-              <w:jc w:val="center"/>
-              <w:rPr>
-                <w:b/>
-                <w:bCs/>
-              </w:rPr>
-            </w:pPr>
-            <w:r>
-              <w:rPr>
-                <w:rFonts w:eastAsia="Aptos" w:cs=""/>
-                <w:b/>
-                <w:bCs/>
-                <w:kern w:val="2"/>
-                <w:sz w:val="24"/>
-                <w:szCs w:val="24"/>
-                <w:lang w:val="pt-BR" w:eastAsia="en-US" w:bidi="ar-SA"/>
-              </w:rPr>
-              <w:t>PROCESSO</w:t>
-            </w:r>
-          </w:p>
-          <w:p>
-            <w:pPr>
-              <w:pStyle w:val="Normal"/>
-              <w:widowControl/>
-              <w:suppressAutoHyphens w:val="true"/>
-              <w:spacing w:lineRule="auto" w:line="240" w:before="0" w:after="0"/>
-              <w:jc w:val="center"/>
-              <w:rPr>
-                <w:b/>
-                <w:bCs/>
-              </w:rPr>
-            </w:pPr>
-            <w:r>
-              <w:rPr>
-                <w:rFonts w:eastAsia="Aptos" w:cs=""/>
-                <w:b/>
-                <w:bCs/>
-                <w:kern w:val="2"/>
-                <w:sz w:val="24"/>
-                <w:szCs w:val="24"/>
-                <w:lang w:val="pt-BR" w:eastAsia="en-US" w:bidi="ar-SA"/>
-              </w:rPr>
-              <w:t>{{NumeroPericia}}</w:t>
-            </w:r>
-          </w:p>
-        </w:tc>
-        <w:tc>
-          <w:tcPr>
-            <w:tcW w:w="2831" w:type="dxa"/>
-            <w:tcBorders/>
-          </w:tcPr>
-          <w:p>
-            <w:pPr>
-              <w:pStyle w:val="Normal"/>
-              <w:widowControl/>
-              <w:suppressAutoHyphens w:val="true"/>
-              <w:spacing w:lineRule="auto" w:line="240" w:before="0" w:after="0"/>
-              <w:jc w:val="center"/>
-              <w:rPr>
-                <w:b/>
-                <w:bCs/>
-              </w:rPr>
-            </w:pPr>
-            <w:r>
-              <w:rPr>
-                <w:rFonts w:eastAsia="Aptos" w:cs=""/>
-                <w:b/>
-                <w:bCs/>
-                <w:kern w:val="2"/>
-                <w:sz w:val="24"/>
-                <w:szCs w:val="24"/>
-                <w:lang w:val="pt-BR" w:eastAsia="en-US" w:bidi="ar-SA"/>
-              </w:rPr>
-              <w:t>Notificação</w:t>
-            </w:r>
-          </w:p>
-          <w:p>
-            <w:pPr>
-              <w:pStyle w:val="Normal"/>
-              <w:widowControl/>
-              <w:suppressAutoHyphens w:val="true"/>
-              <w:spacing w:lineRule="auto" w:line="240" w:before="0" w:after="0"/>
-              <w:jc w:val="center"/>
-              <w:rPr>
-                <w:b/>
-                <w:bCs/>
-              </w:rPr>
-            </w:pPr>
-            <w:r>
-              <w:rPr>
-                <w:rFonts w:eastAsia="Aptos" w:cs=""/>
-                <w:b/>
-                <w:bCs/>
-                <w:kern w:val="2"/>
-                <w:sz w:val="24"/>
-                <w:szCs w:val="24"/>
-                <w:lang w:val="pt-BR" w:eastAsia="en-US" w:bidi="ar-SA"/>
-              </w:rPr>
-              <w:t>Realização de Perícia Técnica</w:t>
-            </w:r>
-          </w:p>
-        </w:tc>
-        <w:tc>
-          <w:tcPr>
-            <w:tcW w:w="2832" w:type="dxa"/>
-            <w:tcBorders/>
-          </w:tcPr>
-          <w:p>
-            <w:pPr>
-              <w:pStyle w:val="Normal"/>
-              <w:widowControl/>
-              <w:suppressAutoHyphens w:val="true"/>
-              <w:spacing w:lineRule="auto" w:line="240" w:before="0" w:after="0"/>
-              <w:jc w:val="left"/>
-              <w:rPr>
-                <w:rFonts w:ascii="Aptos" w:hAnsi="Aptos" w:eastAsia="Aptos" w:cs=""/>
-                <w:kern w:val="2"/>
-                <w:sz w:val="24"/>
-                <w:szCs w:val="24"/>
-                <w:lang w:val="pt-BR" w:eastAsia="en-US" w:bidi="ar-SA"/>
-              </w:rPr>
-            </w:pPr>
-            <w:r>
-              <w:rPr>
-                <w:rFonts w:eastAsia="Aptos" w:cs=""/>
-                <w:kern w:val="2"/>
-                <w:sz w:val="24"/>
-                <w:szCs w:val="24"/>
-                <w:lang w:val="pt-BR" w:eastAsia="en-US" w:bidi="ar-SA"/>
-              </w:rPr>
-            </w:r>
-          </w:p>
-        </w:tc>
-      </w:tr>
-    </w:tbl>
+          <w:rFonts w:ascii="Arial" w:hAnsi="Arial" w:cs="Arial"/>
+          <w:b/>
+          <w:bCs/>
+        </w:rPr>
+      </w:pPr>
+      <w:r>
+        <w:rPr>
+          <w:rFonts w:cs="Arial" w:ascii="Arial" w:hAnsi="Arial"/>
+          <w:b/>
+          <w:bCs/>
+        </w:rPr>
+        <w:t xml:space="preserve">Sumário </w:t>
+      </w:r>
+    </w:p>
     <w:p>
       <w:pPr>
         <w:pStyle w:val="Normal"/>
         <w:spacing w:lineRule="auto" w:line="360"/>
         <w:rPr>
-          <w:rFonts w:cs="Arial"/>
-          <w:b/>
-          <w:bCs/>
-        </w:rPr>
-      </w:pPr>
-      <w:r>
-        <w:rPr>
-          <w:rFonts w:cs="Arial"/>
-          <w:b/>
-          <w:bCs/>
-        </w:rPr>
+          <w:rFonts w:ascii="Arial" w:hAnsi="Arial" w:cs="Arial"/>
+          <w:b/>
+          <w:bCs/>
+        </w:rPr>
+      </w:pPr>
+      <w:r>
+        <w:rPr>
+          <w:rFonts w:cs="Arial" w:ascii="Arial" w:hAnsi="Arial"/>
+          <w:b/>
+          <w:bCs/>
+        </w:rPr>
+        <w:t xml:space="preserve">1. IDENTIFICAÇÃO DO PROCESSO................................................................ </w:t>
       </w:r>
     </w:p>
     <w:p>
@@ -838,7 +519,7 @@
           <w:b/>
           <w:bCs/>
         </w:rPr>
-        <w:t xml:space="preserve">Sumário </w:t>
+        <w:t>2. QUALIFICAÇÃO DO PERITO........................................................................</w:t>
       </w:r>
     </w:p>
     <w:p>
@@ -857,7 +538,15 @@
           <w:b/>
           <w:bCs/>
         </w:rPr>
-        <w:t xml:space="preserve">1. IDENTIFICAÇÃO DO PROCESSO................................................................ </w:t>
+        <w:t xml:space="preserve"> </w:t>
+      </w:r>
+      <w:r>
+        <w:rPr>
+          <w:rFonts w:cs="Arial" w:ascii="Arial" w:hAnsi="Arial"/>
+          <w:b/>
+          <w:bCs/>
+        </w:rPr>
+        <w:t xml:space="preserve">3. FUNDAMENTAÇÃO LEGAL E TÉCNICA..................................................... 4. OBJETO DA PERÍCIA ................................................................................... 5. METODOLOGIA UTILIZADA......................................................................... 6. PRESENTES À DILIGÊNCIA PERICIAL ....................................................... 7. AMBIENTE DE TRABALHO DA RECLAMANTE........................................... 8. DESCRIÇÃO DAS ATIVIDADES DA RECLAMANTE.................................... 9. ANÁLISE DA EXPOSIÇÃO AOS POSSÍVEIS AGENTES INSALUBRES .... 10. CONCLUSÃO TÉCNICA ............................................................................ </w:t>
       </w:r>
     </w:p>
     <w:p>
@@ -876,7 +565,7 @@
           <w:b/>
           <w:bCs/>
         </w:rPr>
-        <w:t>2. QUALIFICAÇÃO DO PERITO........................................................................</w:t>
+        <w:t xml:space="preserve">11. HONORÁRIOS PERICIAIS ....................................................................... 12. RESPOSTAS AOS QUESITOS APRESENTADOS PELA RECLAMANTE................................................................................................ </w:t>
       </w:r>
     </w:p>
     <w:p>
@@ -895,15 +584,7 @@
           <w:b/>
           <w:bCs/>
         </w:rPr>
-        <w:t xml:space="preserve"> </w:t>
-      </w:r>
-      <w:r>
-        <w:rPr>
-          <w:rFonts w:cs="Arial" w:ascii="Arial" w:hAnsi="Arial"/>
-          <w:b/>
-          <w:bCs/>
-        </w:rPr>
-        <w:t xml:space="preserve">3. FUNDAMENTAÇÃO LEGAL E TÉCNICA..................................................... 4. OBJETO DA PERÍCIA ................................................................................... 5. METODOLOGIA UTILIZADA......................................................................... 6. PRESENTES À DILIGÊNCIA PERICIAL ....................................................... 7. AMBIENTE DE TRABALHO DA RECLAMANTE........................................... 8. DESCRIÇÃO DAS ATIVIDADES DA RECLAMANTE.................................... 9. ANÁLISE DA EXPOSIÇÃO AOS POSSÍVEIS AGENTES INSALUBRES .... 10. CONCLUSÃO TÉCNICA ............................................................................ </w:t>
+        <w:t xml:space="preserve">13. RESPOSTAS AOS QUESITOS APRESENTADOS ELA RECLMADA..................................................................................................... </w:t>
       </w:r>
     </w:p>
     <w:p>
@@ -911,18 +592,18 @@
         <w:pStyle w:val="Normal"/>
         <w:spacing w:lineRule="auto" w:line="360"/>
         <w:rPr>
-          <w:rFonts w:ascii="Arial" w:hAnsi="Arial" w:cs="Arial"/>
-          <w:b/>
-          <w:bCs/>
-        </w:rPr>
-      </w:pPr>
-      <w:r>
-        <w:rPr>
-          <w:rFonts w:cs="Arial" w:ascii="Arial" w:hAnsi="Arial"/>
-          <w:b/>
-          <w:bCs/>
-        </w:rPr>
-        <w:t xml:space="preserve">11. HONORÁRIOS PERICIAIS ....................................................................... 12. RESPOSTAS AOS QUESITOS APRESENTADOS PELA RECLAMANTE................................................................................................ </w:t>
+          <w:rFonts w:cs="Arial"/>
+          <w:b/>
+          <w:bCs/>
+        </w:rPr>
+      </w:pPr>
+      <w:r>
+        <w:rPr>
+          <w:rFonts w:cs="Arial" w:ascii="Arial" w:hAnsi="Arial"/>
+          <w:b/>
+          <w:bCs/>
+        </w:rPr>
+        <w:t>14. BIBLIOGRAFIA CONSULTADA ................................................................ 15. ENCENRRAMENTO..............................................................................…</w:t>
       </w:r>
     </w:p>
     <w:p>
@@ -930,18 +611,17 @@
         <w:pStyle w:val="Normal"/>
         <w:spacing w:lineRule="auto" w:line="360"/>
         <w:rPr>
-          <w:rFonts w:ascii="Arial" w:hAnsi="Arial" w:cs="Arial"/>
-          <w:b/>
-          <w:bCs/>
-        </w:rPr>
-      </w:pPr>
-      <w:r>
-        <w:rPr>
-          <w:rFonts w:cs="Arial" w:ascii="Arial" w:hAnsi="Arial"/>
-          <w:b/>
-          <w:bCs/>
-        </w:rPr>
-        <w:t xml:space="preserve">13. RESPOSTAS AOS QUESITOS APRESENTADOS ELA RECLMADA..................................................................................................... </w:t>
+          <w:rFonts w:cs="Arial"/>
+          <w:b/>
+          <w:bCs/>
+        </w:rPr>
+      </w:pPr>
+      <w:r>
+        <w:rPr>
+          <w:rFonts w:cs="Arial"/>
+          <w:b/>
+          <w:bCs/>
+        </w:rPr>
       </w:r>
     </w:p>
     <w:p>
@@ -956,294 +636,83 @@
       </w:pPr>
       <w:r>
         <w:rPr>
-          <w:rFonts w:cs="Arial" w:ascii="Arial" w:hAnsi="Arial"/>
-          <w:b/>
-          <w:bCs/>
-        </w:rPr>
-        <w:t>14. BIBLIOGRAFIA CONSULTADA ................................................................ 15. ENCENRRAMENTO.................................................................................</w:t>
+          <w:rFonts w:cs="Arial"/>
+          <w:b/>
+          <w:bCs/>
+        </w:rPr>
       </w:r>
     </w:p>
     <w:p>
       <w:pPr>
         <w:pStyle w:val="Normal"/>
-        <w:rPr/>
-      </w:pPr>
-      <w:r>
-        <w:rPr/>
+        <w:spacing w:lineRule="auto" w:line="360"/>
+        <w:rPr>
+          <w:rFonts w:cs="Arial"/>
+          <w:b/>
+          <w:bCs/>
+        </w:rPr>
+      </w:pPr>
+      <w:r>
+        <w:rPr>
+          <w:rFonts w:cs="Arial"/>
+          <w:b/>
+          <w:bCs/>
+        </w:rPr>
       </w:r>
     </w:p>
     <w:p>
       <w:pPr>
         <w:pStyle w:val="Normal"/>
-        <w:rPr/>
-      </w:pPr>
-      <w:r>
-        <w:rPr/>
+        <w:spacing w:lineRule="auto" w:line="360"/>
+        <w:rPr>
+          <w:rFonts w:cs="Arial"/>
+          <w:b/>
+          <w:bCs/>
+        </w:rPr>
+      </w:pPr>
+      <w:r>
+        <w:rPr>
+          <w:rFonts w:cs="Arial"/>
+          <w:b/>
+          <w:bCs/>
+        </w:rPr>
       </w:r>
     </w:p>
     <w:p>
       <w:pPr>
         <w:pStyle w:val="Normal"/>
-        <w:rPr/>
-      </w:pPr>
-      <w:r>
-        <w:rPr/>
+        <w:spacing w:lineRule="auto" w:line="360"/>
+        <w:rPr>
+          <w:rFonts w:cs="Arial"/>
+          <w:b/>
+          <w:bCs/>
+        </w:rPr>
+      </w:pPr>
+      <w:r>
+        <w:rPr>
+          <w:rFonts w:cs="Arial"/>
+          <w:b/>
+          <w:bCs/>
+        </w:rPr>
       </w:r>
     </w:p>
     <w:p>
       <w:pPr>
         <w:pStyle w:val="Normal"/>
-        <w:rPr/>
-      </w:pPr>
-      <w:r>
-        <w:rPr/>
-      </w:r>
-    </w:p>
-    <w:p>
-      <w:pPr>
-        <w:pStyle w:val="Normal"/>
-        <w:rPr>
-          <w:rFonts w:ascii="Arial" w:hAnsi="Arial" w:cs="Arial"/>
-        </w:rPr>
-      </w:pPr>
-      <w:r>
-        <w:rPr>
-          <w:rFonts w:cs="Arial" w:ascii="Arial" w:hAnsi="Arial"/>
-        </w:rPr>
-      </w:r>
-    </w:p>
-    <w:p>
-      <w:pPr>
-        <w:pStyle w:val="Normal"/>
-        <w:rPr/>
-      </w:pPr>
-      <w:r>
-        <w:rPr/>
-      </w:r>
-    </w:p>
-    <w:p>
-      <w:pPr>
-        <w:pStyle w:val="Normal"/>
-        <w:rPr/>
-      </w:pPr>
-      <w:r>
-        <w:rPr/>
-      </w:r>
-    </w:p>
-    <w:p>
-      <w:pPr>
-        <w:pStyle w:val="Normal"/>
-        <w:rPr/>
-      </w:pPr>
-      <w:r>
-        <w:rPr/>
-      </w:r>
-    </w:p>
-    <w:tbl>
-      <w:tblPr>
-        <w:tblStyle w:val="Tabelacomgrade"/>
-        <w:tblW w:w="8494" w:type="dxa"/>
-        <w:jc w:val="center"/>
-        <w:tblInd w:w="0" w:type="dxa"/>
-        <w:tblLayout w:type="fixed"/>
-        <w:tblCellMar>
-          <w:top w:w="0" w:type="dxa"/>
-          <w:left w:w="108" w:type="dxa"/>
-          <w:bottom w:w="0" w:type="dxa"/>
-          <w:right w:w="108" w:type="dxa"/>
-        </w:tblCellMar>
-        <w:tblLook w:val="04a0" w:noHBand="0" w:noVBand="1" w:firstColumn="1" w:lastRow="0" w:lastColumn="0" w:firstRow="1"/>
-      </w:tblPr>
-      <w:tblGrid>
-        <w:gridCol w:w="2831"/>
-        <w:gridCol w:w="2831"/>
-        <w:gridCol w:w="2832"/>
-      </w:tblGrid>
-      <w:tr>
-        <w:trPr>
-          <w:trHeight w:val="557" w:hRule="atLeast"/>
-        </w:trPr>
-        <w:tc>
-          <w:tcPr>
-            <w:tcW w:w="2831" w:type="dxa"/>
-            <w:tcBorders/>
-          </w:tcPr>
-          <w:p>
-            <w:pPr>
-              <w:pStyle w:val="Normal"/>
-              <w:widowControl/>
-              <w:suppressAutoHyphens w:val="true"/>
-              <w:spacing w:lineRule="auto" w:line="240" w:before="0" w:after="0"/>
-              <w:jc w:val="center"/>
-              <w:rPr>
-                <w:b/>
-                <w:bCs/>
-              </w:rPr>
-            </w:pPr>
-            <w:r>
-              <w:rPr>
-                <w:rFonts w:eastAsia="Aptos" w:cs=""/>
-                <w:b/>
-                <w:bCs/>
-                <w:kern w:val="2"/>
-                <w:sz w:val="24"/>
-                <w:szCs w:val="24"/>
-                <w:lang w:val="pt-BR" w:eastAsia="en-US" w:bidi="ar-SA"/>
-              </w:rPr>
-              <w:t>PROCESSO</w:t>
-            </w:r>
-          </w:p>
-          <w:p>
-            <w:pPr>
-              <w:pStyle w:val="Normal"/>
-              <w:widowControl/>
-              <w:suppressAutoHyphens w:val="true"/>
-              <w:spacing w:lineRule="auto" w:line="240" w:before="0" w:after="0"/>
-              <w:jc w:val="center"/>
-              <w:rPr>
-                <w:b/>
-                <w:bCs/>
-              </w:rPr>
-            </w:pPr>
-            <w:r>
-              <w:rPr>
-                <w:rFonts w:eastAsia="Aptos" w:cs=""/>
-                <w:b/>
-                <w:bCs/>
-                <w:kern w:val="2"/>
-                <w:sz w:val="24"/>
-                <w:szCs w:val="24"/>
-                <w:lang w:val="pt-BR" w:eastAsia="en-US" w:bidi="ar-SA"/>
-              </w:rPr>
-              <w:t>{{NumeroPericia}}</w:t>
-            </w:r>
-          </w:p>
-        </w:tc>
-        <w:tc>
-          <w:tcPr>
-            <w:tcW w:w="2831" w:type="dxa"/>
-            <w:tcBorders/>
-          </w:tcPr>
-          <w:p>
-            <w:pPr>
-              <w:pStyle w:val="Normal"/>
-              <w:widowControl/>
-              <w:suppressAutoHyphens w:val="true"/>
-              <w:spacing w:lineRule="auto" w:line="240" w:before="0" w:after="0"/>
-              <w:jc w:val="center"/>
-              <w:rPr>
-                <w:b/>
-                <w:bCs/>
-              </w:rPr>
-            </w:pPr>
-            <w:r>
-              <w:rPr>
-                <w:rFonts w:eastAsia="Aptos" w:cs=""/>
-                <w:b/>
-                <w:bCs/>
-                <w:kern w:val="2"/>
-                <w:sz w:val="24"/>
-                <w:szCs w:val="24"/>
-                <w:lang w:val="pt-BR" w:eastAsia="en-US" w:bidi="ar-SA"/>
-              </w:rPr>
-              <w:t>Notificação</w:t>
-            </w:r>
-          </w:p>
-          <w:p>
-            <w:pPr>
-              <w:pStyle w:val="Normal"/>
-              <w:widowControl/>
-              <w:suppressAutoHyphens w:val="true"/>
-              <w:spacing w:lineRule="auto" w:line="240" w:before="0" w:after="0"/>
-              <w:jc w:val="center"/>
-              <w:rPr>
-                <w:b/>
-                <w:bCs/>
-              </w:rPr>
-            </w:pPr>
-            <w:r>
-              <w:rPr>
-                <w:rFonts w:eastAsia="Aptos" w:cs=""/>
-                <w:b/>
-                <w:bCs/>
-                <w:kern w:val="2"/>
-                <w:sz w:val="24"/>
-                <w:szCs w:val="24"/>
-                <w:lang w:val="pt-BR" w:eastAsia="en-US" w:bidi="ar-SA"/>
-              </w:rPr>
-              <w:t>Realização de Perícia Técnica</w:t>
-            </w:r>
-          </w:p>
-        </w:tc>
-        <w:tc>
-          <w:tcPr>
-            <w:tcW w:w="2832" w:type="dxa"/>
-            <w:tcBorders/>
-          </w:tcPr>
-          <w:p>
-            <w:pPr>
-              <w:pStyle w:val="Normal"/>
-              <w:widowControl/>
-              <w:suppressAutoHyphens w:val="true"/>
-              <w:spacing w:lineRule="auto" w:line="240" w:before="0" w:after="0"/>
-              <w:jc w:val="left"/>
-              <w:rPr>
-                <w:rFonts w:ascii="Aptos" w:hAnsi="Aptos" w:eastAsia="Aptos" w:cs=""/>
-                <w:kern w:val="2"/>
-                <w:sz w:val="24"/>
-                <w:szCs w:val="24"/>
-                <w:lang w:val="pt-BR" w:eastAsia="en-US" w:bidi="ar-SA"/>
-              </w:rPr>
-            </w:pPr>
-            <w:r>
-              <w:rPr>
-                <w:rFonts w:eastAsia="Aptos" w:cs=""/>
-                <w:kern w:val="2"/>
-                <w:sz w:val="24"/>
-                <w:szCs w:val="24"/>
-                <w:lang w:val="pt-BR" w:eastAsia="en-US" w:bidi="ar-SA"/>
-              </w:rPr>
-            </w:r>
-          </w:p>
-        </w:tc>
-      </w:tr>
-    </w:tbl>
-    <w:p>
-      <w:pPr>
-        <w:pStyle w:val="Normal"/>
-        <w:jc w:val="center"/>
-        <w:rPr>
-          <w:rFonts w:ascii="Arial" w:hAnsi="Arial" w:cs="Arial"/>
-          <w:b/>
-          <w:bCs/>
-        </w:rPr>
-      </w:pPr>
-      <w:r>
-        <w:rPr>
-          <w:rFonts w:cs="Arial" w:ascii="Arial" w:hAnsi="Arial"/>
-          <w:b/>
-          <w:bCs/>
-        </w:rPr>
-        <w:t>EXMO (A). SR (A). DR (A). JUIZ (A) DA {{NumeroVara}}ª. VARA DO TRABALHO DE</w:t>
-      </w:r>
-    </w:p>
-    <w:p>
-      <w:pPr>
-        <w:pStyle w:val="Normal"/>
-        <w:jc w:val="center"/>
-        <w:rPr>
-          <w:rFonts w:ascii="Arial" w:hAnsi="Arial" w:cs="Arial"/>
-          <w:b/>
-          <w:bCs/>
-        </w:rPr>
-      </w:pPr>
-      <w:r>
-        <w:rPr>
-          <w:rFonts w:cs="Arial" w:ascii="Arial" w:hAnsi="Arial"/>
-          <w:b/>
-          <w:bCs/>
-        </w:rPr>
-        <w:t>MACEIÓ-AL</w:t>
+        <w:spacing w:lineRule="auto" w:line="360"/>
+        <w:rPr>
+          <w:rFonts w:cs="Arial"/>
+          <w:b/>
+          <w:bCs/>
+        </w:rPr>
+      </w:pPr>
+      <w:r>
+        <w:rPr>
+          <w:rFonts w:cs="Arial" w:ascii="Arial" w:hAnsi="Arial"/>
+          <w:b/>
+          <w:bCs/>
+        </w:rPr>
+        <w:t>EXMO (A). SR (A). DR (A). JUIZ (A) DA {{NumeroVara}}ª. VARA DO TRABALHO DE MACEIÓ-AL</w:t>
       </w:r>
     </w:p>
     <w:p>
@@ -1322,8 +791,8 @@
       <w:r>
         <w:rPr>
           <w:rFonts w:cs="Arial" w:ascii="Arial" w:hAnsi="Arial"/>
-          <w:b/>
-          <w:bCs/>
+          <w:b w:val="false"/>
+          <w:bCs w:val="false"/>
           <w:sz w:val="22"/>
           <w:szCs w:val="22"/>
         </w:rPr>
@@ -1362,8 +831,8 @@
       <w:r>
         <w:rPr>
           <w:rFonts w:cs="Arial" w:ascii="Arial" w:hAnsi="Arial"/>
-          <w:b/>
-          <w:bCs/>
+          <w:b w:val="false"/>
+          <w:bCs w:val="false"/>
           <w:sz w:val="22"/>
           <w:szCs w:val="22"/>
         </w:rPr>
@@ -1402,8 +871,8 @@
       <w:r>
         <w:rPr>
           <w:rFonts w:cs="Arial" w:ascii="Arial" w:hAnsi="Arial"/>
-          <w:b/>
-          <w:bCs/>
+          <w:b w:val="false"/>
+          <w:bCs w:val="false"/>
           <w:sz w:val="22"/>
           <w:szCs w:val="22"/>
         </w:rPr>
@@ -1429,27 +898,17 @@
           <w:sz w:val="22"/>
           <w:szCs w:val="22"/>
         </w:rPr>
-        <w:t>OBJETO DA PERÍCIA: {{</w:t>
-      </w:r>
-      <w:r>
-        <w:rPr>
-          <w:rFonts w:cs="Arial" w:ascii="Arial" w:hAnsi="Arial"/>
-          <w:b/>
-          <w:bCs/>
-          <w:sz w:val="22"/>
-          <w:szCs w:val="22"/>
-        </w:rPr>
-        <w:t>Objetivo</w:t>
-      </w:r>
-      <w:r>
-        <w:rPr>
-          <w:rFonts w:cs="Arial" w:ascii="Arial" w:hAnsi="Arial"/>
-          <w:b/>
-          <w:bCs/>
-          <w:sz w:val="22"/>
-          <w:szCs w:val="22"/>
-        </w:rPr>
-        <w:t>}}</w:t>
+        <w:t xml:space="preserve">OBJETO DA PERÍCIA: </w:t>
+      </w:r>
+      <w:r>
+        <w:rPr>
+          <w:rFonts w:cs="Arial" w:ascii="Arial" w:hAnsi="Arial"/>
+          <w:b w:val="false"/>
+          <w:bCs w:val="false"/>
+          <w:sz w:val="22"/>
+          <w:szCs w:val="22"/>
+        </w:rPr>
+        <w:t>{{Objetivo}}</w:t>
       </w:r>
     </w:p>
     <w:p>
@@ -1600,6 +1059,8 @@
       </w:r>
       <w:r>
         <w:rPr>
+          <w:b w:val="false"/>
+          <w:bCs w:val="false"/>
           <w:sz w:val="22"/>
           <w:szCs w:val="22"/>
         </w:rPr>
@@ -1640,12 +1101,14 @@
         <w:pStyle w:val="meusumrio"/>
         <w:ind w:left="708"/>
         <w:rPr>
-          <w:sz w:val="22"/>
-          <w:szCs w:val="22"/>
-        </w:rPr>
-      </w:pPr>
-      <w:r>
-        <w:rPr>
+          <w:b w:val="false"/>
+          <w:bCs w:val="false"/>
+        </w:rPr>
+      </w:pPr>
+      <w:r>
+        <w:rPr>
+          <w:b w:val="false"/>
+          <w:bCs w:val="false"/>
           <w:sz w:val="22"/>
           <w:szCs w:val="22"/>
         </w:rPr>
@@ -1712,175 +1175,6 @@
         <w:rPr/>
       </w:r>
     </w:p>
-    <w:tbl>
-      <w:tblPr>
-        <w:tblStyle w:val="Tabelacomgrade"/>
-        <w:tblW w:w="8494" w:type="dxa"/>
-        <w:jc w:val="center"/>
-        <w:tblInd w:w="0" w:type="dxa"/>
-        <w:tblLayout w:type="fixed"/>
-        <w:tblCellMar>
-          <w:top w:w="0" w:type="dxa"/>
-          <w:left w:w="108" w:type="dxa"/>
-          <w:bottom w:w="0" w:type="dxa"/>
-          <w:right w:w="108" w:type="dxa"/>
-        </w:tblCellMar>
-        <w:tblLook w:val="04a0" w:noHBand="0" w:noVBand="1" w:firstColumn="1" w:lastRow="0" w:lastColumn="0" w:firstRow="1"/>
-      </w:tblPr>
-      <w:tblGrid>
-        <w:gridCol w:w="2831"/>
-        <w:gridCol w:w="2831"/>
-        <w:gridCol w:w="2832"/>
-      </w:tblGrid>
-      <w:tr>
-        <w:trPr>
-          <w:trHeight w:val="557" w:hRule="atLeast"/>
-        </w:trPr>
-        <w:tc>
-          <w:tcPr>
-            <w:tcW w:w="2831" w:type="dxa"/>
-            <w:tcBorders/>
-          </w:tcPr>
-          <w:p>
-            <w:pPr>
-              <w:pStyle w:val="Normal"/>
-              <w:widowControl/>
-              <w:suppressAutoHyphens w:val="true"/>
-              <w:spacing w:lineRule="auto" w:line="240" w:before="0" w:after="0"/>
-              <w:jc w:val="center"/>
-              <w:rPr>
-                <w:b/>
-                <w:bCs/>
-              </w:rPr>
-            </w:pPr>
-            <w:r>
-              <w:rPr>
-                <w:rFonts w:eastAsia="Aptos" w:cs=""/>
-                <w:b/>
-                <w:bCs/>
-                <w:kern w:val="2"/>
-                <w:sz w:val="24"/>
-                <w:szCs w:val="24"/>
-                <w:lang w:val="pt-BR" w:eastAsia="en-US" w:bidi="ar-SA"/>
-              </w:rPr>
-              <w:t>PROCESSO</w:t>
-            </w:r>
-          </w:p>
-          <w:p>
-            <w:pPr>
-              <w:pStyle w:val="Normal"/>
-              <w:widowControl/>
-              <w:suppressAutoHyphens w:val="true"/>
-              <w:spacing w:lineRule="auto" w:line="240" w:before="0" w:after="0"/>
-              <w:jc w:val="center"/>
-              <w:rPr>
-                <w:b/>
-                <w:bCs/>
-              </w:rPr>
-            </w:pPr>
-            <w:r>
-              <w:rPr>
-                <w:rFonts w:eastAsia="Aptos" w:cs=""/>
-                <w:b/>
-                <w:bCs/>
-                <w:kern w:val="2"/>
-                <w:sz w:val="24"/>
-                <w:szCs w:val="24"/>
-                <w:lang w:val="pt-BR" w:eastAsia="en-US" w:bidi="ar-SA"/>
-              </w:rPr>
-              <w:t>{{NumeroPericia}}</w:t>
-            </w:r>
-          </w:p>
-        </w:tc>
-        <w:tc>
-          <w:tcPr>
-            <w:tcW w:w="2831" w:type="dxa"/>
-            <w:tcBorders/>
-          </w:tcPr>
-          <w:p>
-            <w:pPr>
-              <w:pStyle w:val="Normal"/>
-              <w:widowControl/>
-              <w:suppressAutoHyphens w:val="true"/>
-              <w:spacing w:lineRule="auto" w:line="240" w:before="0" w:after="0"/>
-              <w:jc w:val="center"/>
-              <w:rPr>
-                <w:b/>
-                <w:bCs/>
-              </w:rPr>
-            </w:pPr>
-            <w:r>
-              <w:rPr>
-                <w:rFonts w:eastAsia="Aptos" w:cs=""/>
-                <w:b/>
-                <w:bCs/>
-                <w:kern w:val="2"/>
-                <w:sz w:val="24"/>
-                <w:szCs w:val="24"/>
-                <w:lang w:val="pt-BR" w:eastAsia="en-US" w:bidi="ar-SA"/>
-              </w:rPr>
-              <w:t>Notificação</w:t>
-            </w:r>
-          </w:p>
-          <w:p>
-            <w:pPr>
-              <w:pStyle w:val="Normal"/>
-              <w:widowControl/>
-              <w:suppressAutoHyphens w:val="true"/>
-              <w:spacing w:lineRule="auto" w:line="240" w:before="0" w:after="0"/>
-              <w:jc w:val="center"/>
-              <w:rPr>
-                <w:b/>
-                <w:bCs/>
-              </w:rPr>
-            </w:pPr>
-            <w:r>
-              <w:rPr>
-                <w:rFonts w:eastAsia="Aptos" w:cs=""/>
-                <w:b/>
-                <w:bCs/>
-                <w:kern w:val="2"/>
-                <w:sz w:val="24"/>
-                <w:szCs w:val="24"/>
-                <w:lang w:val="pt-BR" w:eastAsia="en-US" w:bidi="ar-SA"/>
-              </w:rPr>
-              <w:t>Realização de Perícia Técnica</w:t>
-            </w:r>
-          </w:p>
-        </w:tc>
-        <w:tc>
-          <w:tcPr>
-            <w:tcW w:w="2832" w:type="dxa"/>
-            <w:tcBorders/>
-          </w:tcPr>
-          <w:p>
-            <w:pPr>
-              <w:pStyle w:val="Normal"/>
-              <w:widowControl/>
-              <w:suppressAutoHyphens w:val="true"/>
-              <w:spacing w:lineRule="auto" w:line="240" w:before="0" w:after="0"/>
-              <w:jc w:val="left"/>
-              <w:rPr>
-                <w:rFonts w:ascii="Aptos" w:hAnsi="Aptos" w:eastAsia="Aptos" w:cs=""/>
-                <w:kern w:val="2"/>
-                <w:sz w:val="24"/>
-                <w:szCs w:val="24"/>
-                <w:lang w:val="pt-BR" w:eastAsia="en-US" w:bidi="ar-SA"/>
-              </w:rPr>
-            </w:pPr>
-            <w:r>
-              <w:rPr>
-                <w:rFonts w:eastAsia="Aptos" w:cs=""/>
-                <w:kern w:val="2"/>
-                <w:sz w:val="24"/>
-                <w:szCs w:val="24"/>
-                <w:lang w:val="pt-BR" w:eastAsia="en-US" w:bidi="ar-SA"/>
-              </w:rPr>
-            </w:r>
-          </w:p>
-        </w:tc>
-      </w:tr>
-    </w:tbl>
     <w:p>
       <w:pPr>
         <w:pStyle w:val="meusumrio"/>
@@ -2141,7 +1435,16 @@
           <w:sz w:val="22"/>
           <w:szCs w:val="22"/>
         </w:rPr>
-        <w:t>Data:{{DataPericia}}</w:t>
+        <w:t>Data:</w:t>
+      </w:r>
+      <w:r>
+        <w:rPr>
+          <w:b w:val="false"/>
+          <w:bCs w:val="false"/>
+          <w:sz w:val="22"/>
+          <w:szCs w:val="22"/>
+        </w:rPr>
+        <w:t>{{DataPericia}}</w:t>
       </w:r>
     </w:p>
     <w:p>
@@ -2158,7 +1461,17 @@
           <w:sz w:val="22"/>
           <w:szCs w:val="22"/>
         </w:rPr>
-        <w:t>Horário:{{HoraPericia}}</w:t>
+        <w:t>Horário:</w:t>
+      </w:r>
+      <w:r>
+        <w:rPr>
+          <w:rFonts w:eastAsia="Aptos" w:cs="" w:ascii="Aptos" w:hAnsi="Aptos" w:asciiTheme="minorHAnsi" w:cstheme="minorBidi" w:eastAsiaTheme="minorHAnsi" w:hAnsiTheme="minorHAnsi"/>
+          <w:sz w:val="22"/>
+          <w:szCs w:val="22"/>
+          <w:shd w:fill="FFFF00" w:val="clear"/>
+          <w14:ligatures w14:val="standardContextual"/>
+        </w:rPr>
+        <w:t>{{HoraPericia}}</w:t>
       </w:r>
     </w:p>
     <w:p>
@@ -2175,7 +1488,16 @@
           <w:sz w:val="22"/>
           <w:szCs w:val="22"/>
         </w:rPr>
-        <w:t>Local:{{LocalDeTrabalho}}</w:t>
+        <w:t>Local:</w:t>
+      </w:r>
+      <w:r>
+        <w:rPr>
+          <w:b w:val="false"/>
+          <w:bCs w:val="false"/>
+          <w:sz w:val="22"/>
+          <w:szCs w:val="22"/>
+        </w:rPr>
+        <w:t>{{LocalDeTrabalho}}</w:t>
       </w:r>
     </w:p>
     <w:p>
@@ -2214,199 +1536,14 @@
         <w:t>PRESENTES À DILIGÊNCIA PERICIAL:</w:t>
       </w:r>
     </w:p>
-    <w:tbl>
-      <w:tblPr>
-        <w:tblStyle w:val="Tabelacomgrade"/>
-        <w:tblW w:w="8134" w:type="dxa"/>
-        <w:jc w:val="left"/>
-        <w:tblInd w:w="360" w:type="dxa"/>
-        <w:tblLayout w:type="fixed"/>
-        <w:tblCellMar>
-          <w:top w:w="0" w:type="dxa"/>
-          <w:left w:w="108" w:type="dxa"/>
-          <w:bottom w:w="0" w:type="dxa"/>
-          <w:right w:w="108" w:type="dxa"/>
-        </w:tblCellMar>
-        <w:tblLook w:val="04a0" w:noHBand="0" w:noVBand="1" w:firstColumn="1" w:lastRow="0" w:lastColumn="0" w:firstRow="1"/>
-      </w:tblPr>
-      <w:tblGrid>
-        <w:gridCol w:w="4058"/>
-        <w:gridCol w:w="4075"/>
-      </w:tblGrid>
-      <w:tr>
-        <w:trPr/>
-        <w:tc>
-          <w:tcPr>
-            <w:tcW w:w="4058" w:type="dxa"/>
-            <w:tcBorders/>
-          </w:tcPr>
-          <w:p>
-            <w:pPr>
-              <w:pStyle w:val="meusumrio"/>
-              <w:widowControl/>
-              <w:suppressAutoHyphens w:val="true"/>
-              <w:spacing w:before="0" w:after="0"/>
-              <w:jc w:val="center"/>
-              <w:rPr>
-                <w:rFonts w:eastAsia="Aptos"/>
-                <w:kern w:val="2"/>
-                <w:sz w:val="24"/>
-                <w:szCs w:val="24"/>
-                <w:lang w:val="pt-BR" w:eastAsia="en-US" w:bidi="ar-SA"/>
-              </w:rPr>
-            </w:pPr>
-            <w:r>
-              <w:rPr>
-                <w:rFonts w:eastAsia="Aptos"/>
-                <w:kern w:val="2"/>
-                <w:sz w:val="24"/>
-                <w:szCs w:val="24"/>
-                <w:lang w:val="pt-BR" w:eastAsia="en-US" w:bidi="ar-SA"/>
-              </w:rPr>
-              <w:t>NOME</w:t>
-            </w:r>
-          </w:p>
-        </w:tc>
-        <w:tc>
-          <w:tcPr>
-            <w:tcW w:w="4075" w:type="dxa"/>
-            <w:tcBorders/>
-          </w:tcPr>
-          <w:p>
-            <w:pPr>
-              <w:pStyle w:val="meusumrio"/>
-              <w:widowControl/>
-              <w:suppressAutoHyphens w:val="true"/>
-              <w:spacing w:before="0" w:after="0"/>
-              <w:jc w:val="center"/>
-              <w:rPr>
-                <w:rFonts w:eastAsia="Aptos"/>
-                <w:kern w:val="2"/>
-                <w:sz w:val="24"/>
-                <w:szCs w:val="24"/>
-                <w:lang w:val="pt-BR" w:eastAsia="en-US" w:bidi="ar-SA"/>
-              </w:rPr>
-            </w:pPr>
-            <w:r>
-              <w:rPr>
-                <w:rFonts w:eastAsia="Aptos"/>
-                <w:kern w:val="2"/>
-                <w:sz w:val="24"/>
-                <w:szCs w:val="24"/>
-                <w:lang w:val="pt-BR" w:eastAsia="en-US" w:bidi="ar-SA"/>
-              </w:rPr>
-              <w:t>FUNÇÃO</w:t>
-            </w:r>
-          </w:p>
-        </w:tc>
-      </w:tr>
-      <w:tr>
-        <w:trPr/>
-        <w:tc>
-          <w:tcPr>
-            <w:tcW w:w="4058" w:type="dxa"/>
-            <w:tcBorders/>
-          </w:tcPr>
-          <w:p>
-            <w:pPr>
-              <w:pStyle w:val="meusumrio"/>
-              <w:widowControl/>
-              <w:suppressAutoHyphens w:val="true"/>
-              <w:spacing w:before="0" w:after="0"/>
-              <w:rPr>
-                <w:sz w:val="28"/>
-                <w:szCs w:val="28"/>
-              </w:rPr>
-            </w:pPr>
-            <w:r>
-              <w:rPr>
-                <w:sz w:val="28"/>
-                <w:szCs w:val="28"/>
-              </w:rPr>
-            </w:r>
-          </w:p>
-        </w:tc>
-        <w:tc>
-          <w:tcPr>
-            <w:tcW w:w="4075" w:type="dxa"/>
-            <w:tcBorders/>
-          </w:tcPr>
-          <w:p>
-            <w:pPr>
-              <w:pStyle w:val="meusumrio"/>
-              <w:widowControl/>
-              <w:suppressAutoHyphens w:val="true"/>
-              <w:spacing w:before="0" w:after="0"/>
-              <w:rPr>
-                <w:sz w:val="28"/>
-                <w:szCs w:val="28"/>
-              </w:rPr>
-            </w:pPr>
-            <w:r>
-              <w:rPr>
-                <w:sz w:val="28"/>
-                <w:szCs w:val="28"/>
-              </w:rPr>
-            </w:r>
-          </w:p>
-        </w:tc>
-      </w:tr>
-      <w:tr>
-        <w:trPr/>
-        <w:tc>
-          <w:tcPr>
-            <w:tcW w:w="4058" w:type="dxa"/>
-            <w:tcBorders/>
-          </w:tcPr>
-          <w:p>
-            <w:pPr>
-              <w:pStyle w:val="meusumrio"/>
-              <w:widowControl/>
-              <w:suppressAutoHyphens w:val="true"/>
-              <w:spacing w:before="0" w:after="0"/>
-              <w:rPr>
-                <w:sz w:val="28"/>
-                <w:szCs w:val="28"/>
-              </w:rPr>
-            </w:pPr>
-            <w:r>
-              <w:rPr>
-                <w:sz w:val="28"/>
-                <w:szCs w:val="28"/>
-              </w:rPr>
-            </w:r>
-          </w:p>
-        </w:tc>
-        <w:tc>
-          <w:tcPr>
-            <w:tcW w:w="4075" w:type="dxa"/>
-            <w:tcBorders/>
-          </w:tcPr>
-          <w:p>
-            <w:pPr>
-              <w:pStyle w:val="meusumrio"/>
-              <w:widowControl/>
-              <w:suppressAutoHyphens w:val="true"/>
-              <w:spacing w:before="0" w:after="0"/>
-              <w:rPr>
-                <w:sz w:val="28"/>
-                <w:szCs w:val="28"/>
-              </w:rPr>
-            </w:pPr>
-            <w:r>
-              <w:rPr>
-                <w:sz w:val="28"/>
-                <w:szCs w:val="28"/>
-              </w:rPr>
-            </w:r>
-          </w:p>
-        </w:tc>
-      </w:tr>
-    </w:tbl>
     <w:p>
       <w:pPr>
         <w:pStyle w:val="meusumrio"/>
-        <w:ind w:left="360"/>
+        <w:numPr>
+          <w:ilvl w:val="0"/>
+          <w:numId w:val="0"/>
+        </w:numPr>
+        <w:ind w:hanging="0" w:left="360"/>
         <w:rPr>
           <w:sz w:val="28"/>
           <w:szCs w:val="28"/>
@@ -2414,260 +1551,30 @@
       </w:pPr>
       <w:r>
         <w:rPr>
-          <w:sz w:val="28"/>
-          <w:szCs w:val="28"/>
-        </w:rPr>
-      </w:r>
-    </w:p>
-    <w:p>
-      <w:pPr>
-        <w:pStyle w:val="meusumrio"/>
-        <w:ind w:left="360"/>
-        <w:rPr>
-          <w:sz w:val="22"/>
-          <w:szCs w:val="22"/>
-        </w:rPr>
-      </w:pPr>
-      <w:r>
-        <w:rPr>
-          <w:sz w:val="22"/>
-          <w:szCs w:val="22"/>
-        </w:rPr>
-      </w:r>
-    </w:p>
-    <w:p>
-      <w:pPr>
-        <w:pStyle w:val="ListParagraph"/>
-        <w:ind w:left="360"/>
-        <w:rPr>
-          <w:rFonts w:ascii="Arial" w:hAnsi="Arial" w:cs="Arial"/>
-          <w:b/>
-          <w:bCs/>
-          <w:sz w:val="28"/>
-          <w:szCs w:val="28"/>
-        </w:rPr>
-      </w:pPr>
-      <w:r>
-        <w:rPr>
-          <w:rFonts w:cs="Arial" w:ascii="Arial" w:hAnsi="Arial"/>
-          <w:b/>
-          <w:bCs/>
-          <w:sz w:val="28"/>
-          <w:szCs w:val="28"/>
-        </w:rPr>
-      </w:r>
-    </w:p>
-    <w:p>
-      <w:pPr>
-        <w:pStyle w:val="ListParagraph"/>
-        <w:ind w:left="360"/>
-        <w:rPr>
-          <w:rFonts w:ascii="Arial" w:hAnsi="Arial" w:cs="Arial"/>
-          <w:b/>
-          <w:bCs/>
-          <w:sz w:val="28"/>
-          <w:szCs w:val="28"/>
-        </w:rPr>
-      </w:pPr>
-      <w:r>
-        <w:rPr>
-          <w:rFonts w:cs="Arial" w:ascii="Arial" w:hAnsi="Arial"/>
-          <w:b/>
-          <w:bCs/>
-          <w:sz w:val="28"/>
-          <w:szCs w:val="28"/>
-        </w:rPr>
-      </w:r>
-    </w:p>
-    <w:tbl>
-      <w:tblPr>
-        <w:tblStyle w:val="Tabelacomgrade"/>
-        <w:tblW w:w="8494" w:type="dxa"/>
-        <w:jc w:val="center"/>
-        <w:tblInd w:w="0" w:type="dxa"/>
-        <w:tblLayout w:type="fixed"/>
-        <w:tblCellMar>
-          <w:top w:w="0" w:type="dxa"/>
-          <w:left w:w="108" w:type="dxa"/>
-          <w:bottom w:w="0" w:type="dxa"/>
-          <w:right w:w="108" w:type="dxa"/>
-        </w:tblCellMar>
-        <w:tblLook w:val="04a0" w:noHBand="0" w:noVBand="1" w:firstColumn="1" w:lastRow="0" w:lastColumn="0" w:firstRow="1"/>
-      </w:tblPr>
-      <w:tblGrid>
-        <w:gridCol w:w="2831"/>
-        <w:gridCol w:w="2831"/>
-        <w:gridCol w:w="2832"/>
-      </w:tblGrid>
-      <w:tr>
-        <w:trPr>
-          <w:trHeight w:val="557" w:hRule="atLeast"/>
-        </w:trPr>
-        <w:tc>
-          <w:tcPr>
-            <w:tcW w:w="2831" w:type="dxa"/>
-            <w:tcBorders/>
-          </w:tcPr>
-          <w:p>
-            <w:pPr>
-              <w:pStyle w:val="Normal"/>
-              <w:widowControl/>
-              <w:suppressAutoHyphens w:val="true"/>
-              <w:spacing w:lineRule="auto" w:line="240" w:before="0" w:after="0"/>
-              <w:jc w:val="center"/>
-              <w:rPr>
-                <w:b/>
-                <w:bCs/>
-              </w:rPr>
-            </w:pPr>
-            <w:r>
-              <w:rPr>
-                <w:rFonts w:eastAsia="Aptos" w:cs=""/>
-                <w:b/>
-                <w:bCs/>
-                <w:kern w:val="2"/>
-                <w:sz w:val="24"/>
-                <w:szCs w:val="24"/>
-                <w:lang w:val="pt-BR" w:eastAsia="en-US" w:bidi="ar-SA"/>
-              </w:rPr>
-              <w:t>PROCESSO</w:t>
-            </w:r>
-          </w:p>
-          <w:p>
-            <w:pPr>
-              <w:pStyle w:val="Normal"/>
-              <w:widowControl/>
-              <w:suppressAutoHyphens w:val="true"/>
-              <w:spacing w:lineRule="auto" w:line="240" w:before="0" w:after="0"/>
-              <w:jc w:val="center"/>
-              <w:rPr>
-                <w:b/>
-                <w:bCs/>
-              </w:rPr>
-            </w:pPr>
-            <w:r>
-              <w:rPr>
-                <w:rFonts w:eastAsia="Aptos" w:cs=""/>
-                <w:b/>
-                <w:bCs/>
-                <w:kern w:val="2"/>
-                <w:sz w:val="24"/>
-                <w:szCs w:val="24"/>
-                <w:lang w:val="pt-BR" w:eastAsia="en-US" w:bidi="ar-SA"/>
-              </w:rPr>
-              <w:t>{{NumeroPericia}}</w:t>
-            </w:r>
-          </w:p>
-        </w:tc>
-        <w:tc>
-          <w:tcPr>
-            <w:tcW w:w="2831" w:type="dxa"/>
-            <w:tcBorders/>
-          </w:tcPr>
-          <w:p>
-            <w:pPr>
-              <w:pStyle w:val="Normal"/>
-              <w:widowControl/>
-              <w:suppressAutoHyphens w:val="true"/>
-              <w:spacing w:lineRule="auto" w:line="240" w:before="0" w:after="0"/>
-              <w:jc w:val="center"/>
-              <w:rPr>
-                <w:b/>
-                <w:bCs/>
-              </w:rPr>
-            </w:pPr>
-            <w:r>
-              <w:rPr>
-                <w:rFonts w:eastAsia="Aptos" w:cs=""/>
-                <w:b/>
-                <w:bCs/>
-                <w:kern w:val="2"/>
-                <w:sz w:val="24"/>
-                <w:szCs w:val="24"/>
-                <w:lang w:val="pt-BR" w:eastAsia="en-US" w:bidi="ar-SA"/>
-              </w:rPr>
-              <w:t>Notificação</w:t>
-            </w:r>
-          </w:p>
-          <w:p>
-            <w:pPr>
-              <w:pStyle w:val="Normal"/>
-              <w:widowControl/>
-              <w:suppressAutoHyphens w:val="true"/>
-              <w:spacing w:lineRule="auto" w:line="240" w:before="0" w:after="0"/>
-              <w:jc w:val="center"/>
-              <w:rPr>
-                <w:b/>
-                <w:bCs/>
-              </w:rPr>
-            </w:pPr>
-            <w:r>
-              <w:rPr>
-                <w:rFonts w:eastAsia="Aptos" w:cs=""/>
-                <w:b/>
-                <w:bCs/>
-                <w:kern w:val="2"/>
-                <w:sz w:val="24"/>
-                <w:szCs w:val="24"/>
-                <w:lang w:val="pt-BR" w:eastAsia="en-US" w:bidi="ar-SA"/>
-              </w:rPr>
-              <w:t>Realização de Perícia Técnica</w:t>
-            </w:r>
-          </w:p>
-        </w:tc>
-        <w:tc>
-          <w:tcPr>
-            <w:tcW w:w="2832" w:type="dxa"/>
-            <w:tcBorders/>
-          </w:tcPr>
-          <w:p>
-            <w:pPr>
-              <w:pStyle w:val="Normal"/>
-              <w:widowControl/>
-              <w:suppressAutoHyphens w:val="true"/>
-              <w:spacing w:lineRule="auto" w:line="240" w:before="0" w:after="0"/>
-              <w:jc w:val="left"/>
-              <w:rPr>
-                <w:rFonts w:ascii="Aptos" w:hAnsi="Aptos" w:eastAsia="Aptos" w:cs=""/>
-                <w:kern w:val="2"/>
-                <w:sz w:val="24"/>
-                <w:szCs w:val="24"/>
-                <w:lang w:val="pt-BR" w:eastAsia="en-US" w:bidi="ar-SA"/>
-              </w:rPr>
-            </w:pPr>
-            <w:r>
-              <w:rPr>
-                <w:rFonts w:eastAsia="Aptos" w:cs=""/>
-                <w:kern w:val="2"/>
-                <w:sz w:val="24"/>
-                <w:szCs w:val="24"/>
-                <w:lang w:val="pt-BR" w:eastAsia="en-US" w:bidi="ar-SA"/>
-              </w:rPr>
-            </w:r>
-          </w:p>
-        </w:tc>
-      </w:tr>
-    </w:tbl>
-    <w:p>
-      <w:pPr>
-        <w:pStyle w:val="ListParagraph"/>
-        <w:ind w:left="360"/>
-        <w:rPr>
-          <w:rFonts w:ascii="Arial" w:hAnsi="Arial" w:cs="Arial"/>
-          <w:b/>
-          <w:bCs/>
-          <w:sz w:val="28"/>
-          <w:szCs w:val="28"/>
-        </w:rPr>
-      </w:pPr>
-      <w:r>
-        <w:rPr>
-          <w:rFonts w:cs="Arial" w:ascii="Arial" w:hAnsi="Arial"/>
-          <w:b/>
-          <w:bCs/>
-          <w:sz w:val="28"/>
-          <w:szCs w:val="28"/>
-        </w:rPr>
+          <w:b w:val="false"/>
+          <w:bCs w:val="false"/>
+          <w:sz w:val="24"/>
+          <w:szCs w:val="24"/>
+        </w:rPr>
+        <w:t>{{</w:t>
+      </w:r>
+      <w:r>
+        <w:rPr>
+          <w:b w:val="false"/>
+          <w:bCs w:val="false"/>
+          <w:sz w:val="24"/>
+          <w:szCs w:val="24"/>
+        </w:rPr>
+        <w:t>presentes</w:t>
+      </w:r>
+      <w:r>
+        <w:rPr>
+          <w:b w:val="false"/>
+          <w:bCs w:val="false"/>
+          <w:sz w:val="24"/>
+          <w:szCs w:val="24"/>
+        </w:rPr>
+        <w:t>}}</w:t>
       </w:r>
     </w:p>
     <w:p>
@@ -2761,7 +1668,8 @@
       <w:r>
         <w:rPr>
           <w:rFonts w:cs="Arial" w:ascii="Arial" w:hAnsi="Arial"/>
-          <w:b/>
+          <w:b w:val="false"/>
+          <w:bCs w:val="false"/>
           <w:sz w:val="22"/>
           <w:szCs w:val="22"/>
         </w:rPr>
@@ -2779,7 +1687,8 @@
       <w:r>
         <w:rPr>
           <w:rFonts w:cs="Arial" w:ascii="Arial" w:hAnsi="Arial"/>
-          <w:b/>
+          <w:b w:val="false"/>
+          <w:bCs w:val="false"/>
           <w:sz w:val="22"/>
           <w:szCs w:val="22"/>
         </w:rPr>
@@ -2797,7 +1706,8 @@
       <w:r>
         <w:rPr>
           <w:rFonts w:cs="Arial" w:ascii="Arial" w:hAnsi="Arial"/>
-          <w:b/>
+          <w:b w:val="false"/>
+          <w:bCs w:val="false"/>
           <w:sz w:val="22"/>
           <w:szCs w:val="22"/>
         </w:rPr>
@@ -2815,7 +1725,8 @@
       <w:r>
         <w:rPr>
           <w:rFonts w:cs="Arial" w:ascii="Arial" w:hAnsi="Arial"/>
-          <w:b/>
+          <w:b w:val="false"/>
+          <w:bCs w:val="false"/>
           <w:sz w:val="22"/>
           <w:szCs w:val="22"/>
         </w:rPr>
@@ -2833,7 +1744,8 @@
       <w:r>
         <w:rPr>
           <w:rFonts w:cs="Arial" w:ascii="Arial" w:hAnsi="Arial"/>
-          <w:b/>
+          <w:b w:val="false"/>
+          <w:bCs w:val="false"/>
           <w:sz w:val="22"/>
           <w:szCs w:val="22"/>
         </w:rPr>
@@ -3055,6 +1967,8 @@
           <w:bCs/>
           <w:sz w:val="22"/>
           <w:szCs w:val="22"/>
+          <w:shd w:fill="FFFF00" w:val="clear"/>
+          <w14:ligatures w14:val="standardContextual"/>
         </w:rPr>
         <w:t>{{HoraPericia}}</w:t>
       </w:r>
@@ -3069,8 +1983,8 @@
       <w:r>
         <w:rPr>
           <w:rFonts w:cs="Arial" w:ascii="Arial" w:hAnsi="Arial"/>
-          <w:b/>
-          <w:bCs/>
+          <w:b w:val="false"/>
+          <w:bCs w:val="false"/>
           <w:sz w:val="22"/>
           <w:szCs w:val="22"/>
         </w:rPr>
@@ -3137,199 +2051,6 @@
     <w:p>
       <w:pPr>
         <w:pStyle w:val="Normal"/>
-        <w:rPr>
-          <w:rFonts w:ascii="Arial" w:hAnsi="Arial" w:cs="Arial"/>
-          <w:bCs/>
-          <w:sz w:val="22"/>
-          <w:szCs w:val="22"/>
-        </w:rPr>
-      </w:pPr>
-      <w:r>
-        <w:rPr>
-          <w:rFonts w:cs="Arial" w:ascii="Arial" w:hAnsi="Arial"/>
-          <w:bCs/>
-          <w:sz w:val="22"/>
-          <w:szCs w:val="22"/>
-        </w:rPr>
-      </w:r>
-      <w:r>
-        <w:br w:type="page"/>
-      </w:r>
-    </w:p>
-    <w:tbl>
-      <w:tblPr>
-        <w:tblStyle w:val="Tabelacomgrade"/>
-        <w:tblW w:w="8494" w:type="dxa"/>
-        <w:jc w:val="center"/>
-        <w:tblInd w:w="0" w:type="dxa"/>
-        <w:tblLayout w:type="fixed"/>
-        <w:tblCellMar>
-          <w:top w:w="0" w:type="dxa"/>
-          <w:left w:w="108" w:type="dxa"/>
-          <w:bottom w:w="0" w:type="dxa"/>
-          <w:right w:w="108" w:type="dxa"/>
-        </w:tblCellMar>
-        <w:tblLook w:val="04a0" w:noHBand="0" w:noVBand="1" w:firstColumn="1" w:lastRow="0" w:lastColumn="0" w:firstRow="1"/>
-      </w:tblPr>
-      <w:tblGrid>
-        <w:gridCol w:w="2831"/>
-        <w:gridCol w:w="2831"/>
-        <w:gridCol w:w="2832"/>
-      </w:tblGrid>
-      <w:tr>
-        <w:trPr>
-          <w:trHeight w:val="557" w:hRule="atLeast"/>
-        </w:trPr>
-        <w:tc>
-          <w:tcPr>
-            <w:tcW w:w="2831" w:type="dxa"/>
-            <w:tcBorders/>
-          </w:tcPr>
-          <w:p>
-            <w:pPr>
-              <w:pStyle w:val="Normal"/>
-              <w:pageBreakBefore/>
-              <w:widowControl/>
-              <w:suppressAutoHyphens w:val="true"/>
-              <w:spacing w:lineRule="auto" w:line="240" w:before="0" w:after="0"/>
-              <w:jc w:val="center"/>
-              <w:rPr>
-                <w:b/>
-                <w:bCs/>
-              </w:rPr>
-            </w:pPr>
-            <w:r>
-              <w:rPr>
-                <w:rFonts w:eastAsia="Aptos" w:cs=""/>
-                <w:b/>
-                <w:bCs/>
-                <w:kern w:val="2"/>
-                <w:sz w:val="24"/>
-                <w:szCs w:val="24"/>
-                <w:lang w:val="pt-BR" w:eastAsia="en-US" w:bidi="ar-SA"/>
-              </w:rPr>
-              <w:t>PROCESSO</w:t>
-            </w:r>
-          </w:p>
-          <w:p>
-            <w:pPr>
-              <w:pStyle w:val="Normal"/>
-              <w:widowControl/>
-              <w:suppressAutoHyphens w:val="true"/>
-              <w:spacing w:lineRule="auto" w:line="240" w:before="0" w:after="0"/>
-              <w:jc w:val="center"/>
-              <w:rPr>
-                <w:b/>
-                <w:bCs/>
-              </w:rPr>
-            </w:pPr>
-            <w:r>
-              <w:rPr>
-                <w:rFonts w:eastAsia="Aptos" w:cs=""/>
-                <w:b/>
-                <w:bCs/>
-                <w:kern w:val="2"/>
-                <w:sz w:val="24"/>
-                <w:szCs w:val="24"/>
-                <w:lang w:val="pt-BR" w:eastAsia="en-US" w:bidi="ar-SA"/>
-              </w:rPr>
-              <w:t>{{NumeroPericia}}</w:t>
-            </w:r>
-          </w:p>
-        </w:tc>
-        <w:tc>
-          <w:tcPr>
-            <w:tcW w:w="2831" w:type="dxa"/>
-            <w:tcBorders/>
-          </w:tcPr>
-          <w:p>
-            <w:pPr>
-              <w:pStyle w:val="Normal"/>
-              <w:widowControl/>
-              <w:suppressAutoHyphens w:val="true"/>
-              <w:spacing w:lineRule="auto" w:line="240" w:before="0" w:after="0"/>
-              <w:jc w:val="center"/>
-              <w:rPr>
-                <w:b/>
-                <w:bCs/>
-              </w:rPr>
-            </w:pPr>
-            <w:r>
-              <w:rPr>
-                <w:rFonts w:eastAsia="Aptos" w:cs=""/>
-                <w:b/>
-                <w:bCs/>
-                <w:kern w:val="2"/>
-                <w:sz w:val="24"/>
-                <w:szCs w:val="24"/>
-                <w:lang w:val="pt-BR" w:eastAsia="en-US" w:bidi="ar-SA"/>
-              </w:rPr>
-              <w:t>Notificação</w:t>
-            </w:r>
-          </w:p>
-          <w:p>
-            <w:pPr>
-              <w:pStyle w:val="Normal"/>
-              <w:widowControl/>
-              <w:suppressAutoHyphens w:val="true"/>
-              <w:spacing w:lineRule="auto" w:line="240" w:before="0" w:after="0"/>
-              <w:jc w:val="center"/>
-              <w:rPr>
-                <w:b/>
-                <w:bCs/>
-              </w:rPr>
-            </w:pPr>
-            <w:r>
-              <w:rPr>
-                <w:rFonts w:eastAsia="Aptos" w:cs=""/>
-                <w:b/>
-                <w:bCs/>
-                <w:kern w:val="2"/>
-                <w:sz w:val="24"/>
-                <w:szCs w:val="24"/>
-                <w:lang w:val="pt-BR" w:eastAsia="en-US" w:bidi="ar-SA"/>
-              </w:rPr>
-              <w:t>Realização de Perícia Técnica</w:t>
-            </w:r>
-          </w:p>
-        </w:tc>
-        <w:tc>
-          <w:tcPr>
-            <w:tcW w:w="2832" w:type="dxa"/>
-            <w:tcBorders/>
-          </w:tcPr>
-          <w:p>
-            <w:pPr>
-              <w:pStyle w:val="Normal"/>
-              <w:widowControl/>
-              <w:suppressAutoHyphens w:val="true"/>
-              <w:spacing w:lineRule="auto" w:line="240" w:before="0" w:after="0"/>
-              <w:jc w:val="left"/>
-              <w:rPr>
-                <w:rFonts w:ascii="Aptos" w:hAnsi="Aptos" w:eastAsia="Aptos" w:cs=""/>
-                <w:kern w:val="2"/>
-                <w:sz w:val="24"/>
-                <w:szCs w:val="24"/>
-                <w:lang w:val="pt-BR" w:eastAsia="en-US" w:bidi="ar-SA"/>
-              </w:rPr>
-            </w:pPr>
-            <w:r>
-              <w:rPr>
-                <w:rFonts w:eastAsia="Aptos" w:cs=""/>
-                <w:kern w:val="2"/>
-                <w:sz w:val="24"/>
-                <w:szCs w:val="24"/>
-                <w:lang w:val="pt-BR" w:eastAsia="en-US" w:bidi="ar-SA"/>
-              </w:rPr>
-            </w:r>
-          </w:p>
-        </w:tc>
-      </w:tr>
-    </w:tbl>
-    <w:p>
-      <w:pPr>
-        <w:pStyle w:val="ListParagraph"/>
-        <w:jc w:val="both"/>
         <w:rPr>
           <w:rFonts w:ascii="Arial" w:hAnsi="Arial" w:cs="Arial"/>
           <w:bCs/>
@@ -3651,13 +2372,17 @@
       </w:r>
       <w:r>
         <w:rPr>
-          <w:sz w:val="22"/>
-          <w:szCs w:val="22"/>
-        </w:rPr>
-        <w:t>{{TipoDeLaudo}}</w:t>
-      </w:r>
-      <w:r>
-        <w:rPr>
+          <w:b w:val="false"/>
+          <w:bCs w:val="false"/>
+          <w:sz w:val="22"/>
+          <w:szCs w:val="22"/>
+        </w:rPr>
+        <w:t>{{Classificacao}}</w:t>
+      </w:r>
+      <w:r>
+        <w:rPr>
+          <w:b w:val="false"/>
+          <w:bCs w:val="false"/>
           <w:sz w:val="22"/>
           <w:szCs w:val="22"/>
           <w:u w:val="single"/>
@@ -3675,10 +2400,19 @@
       </w:r>
       <w:r>
         <w:rPr>
-          <w:sz w:val="22"/>
-          <w:szCs w:val="22"/>
-        </w:rPr>
-        <w:t xml:space="preserve">{{TipoDaNorma}} </w:t>
+          <w:b w:val="false"/>
+          <w:bCs w:val="false"/>
+          <w:sz w:val="22"/>
+          <w:szCs w:val="22"/>
+        </w:rPr>
+        <w:t>{{TipoNorma}}</w:t>
+      </w:r>
+      <w:r>
+        <w:rPr>
+          <w:sz w:val="22"/>
+          <w:szCs w:val="22"/>
+        </w:rPr>
+        <w:t xml:space="preserve"> </w:t>
       </w:r>
       <w:r>
         <w:rPr>
@@ -3780,9 +2514,12 @@
       </w:r>
     </w:p>
     <w:sectPr>
+      <w:headerReference w:type="even" r:id="rId2"/>
+      <w:headerReference w:type="default" r:id="rId3"/>
+      <w:headerReference w:type="first" r:id="rId4"/>
       <w:type w:val="nextPage"/>
       <w:pgSz w:w="11906" w:h="16838"/>
-      <w:pgMar w:left="1701" w:right="1701" w:gutter="0" w:header="0" w:top="1417" w:footer="0" w:bottom="1417"/>
+      <w:pgMar w:left="1701" w:right="1701" w:gutter="0" w:header="1417" w:top="3229" w:footer="0" w:bottom="1417"/>
       <w:pgNumType w:fmt="decimal"/>
       <w:formProt w:val="false"/>
       <w:textDirection w:val="lrTb"/>
@@ -3790,6 +2527,388 @@
     </w:sectPr>
   </w:body>
 </w:document>
+</file>
+
+<file path=word/header1.xml><?xml version="1.0" encoding="utf-8"?>
+<w:hdr xmlns:o="urn:schemas-microsoft-com:office:office" xmlns:r="http://schemas.openxmlformats.org/officeDocument/2006/relationships" xmlns:v="urn:schemas-microsoft-com:vml" xmlns:w="http://schemas.openxmlformats.org/wordprocessingml/2006/main" xmlns:w10="urn:schemas-microsoft-com:office:word" xmlns:wp="http://schemas.openxmlformats.org/drawingml/2006/wordprocessingDrawing" xmlns:wps="http://schemas.microsoft.com/office/word/2010/wordprocessingShape" xmlns:wpg="http://schemas.microsoft.com/office/word/2010/wordprocessingGroup" xmlns:mc="http://schemas.openxmlformats.org/markup-compatibility/2006" xmlns:wp14="http://schemas.microsoft.com/office/word/2010/wordprocessingDrawing" xmlns:w14="http://schemas.microsoft.com/office/word/2010/wordml" xmlns:w15="http://schemas.microsoft.com/office/word/2012/wordml" mc:Ignorable="w14 wp14 w15">
+  <w:p>
+    <w:pPr>
+      <w:pStyle w:val="Header"/>
+      <w:rPr/>
+    </w:pPr>
+    <w:r>
+      <w:rPr/>
+    </w:r>
+  </w:p>
+</w:hdr>
+</file>
+
+<file path=word/header2.xml><?xml version="1.0" encoding="utf-8"?>
+<w:hdr xmlns:o="urn:schemas-microsoft-com:office:office" xmlns:r="http://schemas.openxmlformats.org/officeDocument/2006/relationships" xmlns:v="urn:schemas-microsoft-com:vml" xmlns:w="http://schemas.openxmlformats.org/wordprocessingml/2006/main" xmlns:w10="urn:schemas-microsoft-com:office:word" xmlns:wp="http://schemas.openxmlformats.org/drawingml/2006/wordprocessingDrawing" xmlns:wps="http://schemas.microsoft.com/office/word/2010/wordprocessingShape" xmlns:wpg="http://schemas.microsoft.com/office/word/2010/wordprocessingGroup" xmlns:mc="http://schemas.openxmlformats.org/markup-compatibility/2006" xmlns:wp14="http://schemas.microsoft.com/office/word/2010/wordprocessingDrawing" xmlns:w14="http://schemas.microsoft.com/office/word/2010/wordml" xmlns:w15="http://schemas.microsoft.com/office/word/2012/wordml" mc:Ignorable="w14 wp14 w15">
+  <w:tbl>
+    <w:tblPr>
+      <w:tblStyle w:val="Tabelacomgrade"/>
+      <w:tblW w:w="8494" w:type="dxa"/>
+      <w:jc w:val="center"/>
+      <w:tblInd w:w="0" w:type="dxa"/>
+      <w:tblLayout w:type="fixed"/>
+      <w:tblCellMar>
+        <w:top w:w="0" w:type="dxa"/>
+        <w:left w:w="108" w:type="dxa"/>
+        <w:bottom w:w="0" w:type="dxa"/>
+        <w:right w:w="108" w:type="dxa"/>
+      </w:tblCellMar>
+      <w:tblLook w:val="04a0" w:noHBand="0" w:noVBand="1" w:firstColumn="1" w:lastRow="0" w:lastColumn="0" w:firstRow="1"/>
+    </w:tblPr>
+    <w:tblGrid>
+      <w:gridCol w:w="2831"/>
+      <w:gridCol w:w="2831"/>
+      <w:gridCol w:w="2832"/>
+    </w:tblGrid>
+    <w:tr>
+      <w:trPr>
+        <w:trHeight w:val="557" w:hRule="atLeast"/>
+      </w:trPr>
+      <w:tc>
+        <w:tcPr>
+          <w:tcW w:w="2831" w:type="dxa"/>
+          <w:tcBorders/>
+        </w:tcPr>
+        <w:p>
+          <w:pPr>
+            <w:pStyle w:val="Normal"/>
+            <w:widowControl/>
+            <w:suppressAutoHyphens w:val="true"/>
+            <w:spacing w:lineRule="auto" w:line="240" w:before="0" w:after="0"/>
+            <w:jc w:val="center"/>
+            <w:rPr>
+              <w:b/>
+              <w:bCs/>
+            </w:rPr>
+          </w:pPr>
+          <w:r>
+            <w:rPr>
+              <w:rFonts w:eastAsia="Aptos" w:cs=""/>
+              <w:b/>
+              <w:bCs/>
+              <w:kern w:val="2"/>
+              <w:sz w:val="24"/>
+              <w:szCs w:val="24"/>
+              <w:lang w:val="pt-BR" w:eastAsia="en-US" w:bidi="ar-SA"/>
+            </w:rPr>
+            <w:t>PROCESSO</w:t>
+          </w:r>
+        </w:p>
+        <w:p>
+          <w:pPr>
+            <w:pStyle w:val="Normal"/>
+            <w:widowControl/>
+            <w:suppressAutoHyphens w:val="true"/>
+            <w:spacing w:lineRule="auto" w:line="240" w:before="0" w:after="0"/>
+            <w:jc w:val="center"/>
+            <w:rPr>
+              <w:b/>
+              <w:bCs/>
+            </w:rPr>
+          </w:pPr>
+          <w:r>
+            <w:rPr>
+              <w:rFonts w:eastAsia="Aptos" w:cs=""/>
+              <w:b/>
+              <w:bCs/>
+              <w:kern w:val="2"/>
+              <w:sz w:val="24"/>
+              <w:szCs w:val="24"/>
+              <w:lang w:val="pt-BR" w:eastAsia="en-US" w:bidi="ar-SA"/>
+            </w:rPr>
+            <w:t>{{NumeroPericia}}</w:t>
+          </w:r>
+        </w:p>
+      </w:tc>
+      <w:tc>
+        <w:tcPr>
+          <w:tcW w:w="2831" w:type="dxa"/>
+          <w:tcBorders/>
+        </w:tcPr>
+        <w:p>
+          <w:pPr>
+            <w:pStyle w:val="Normal"/>
+            <w:widowControl/>
+            <w:suppressAutoHyphens w:val="true"/>
+            <w:spacing w:lineRule="auto" w:line="240" w:before="0" w:after="0"/>
+            <w:jc w:val="center"/>
+            <w:rPr>
+              <w:b/>
+              <w:bCs/>
+            </w:rPr>
+          </w:pPr>
+          <w:r>
+            <w:rPr>
+              <w:rFonts w:eastAsia="Aptos" w:cs=""/>
+              <w:b/>
+              <w:bCs/>
+              <w:kern w:val="2"/>
+              <w:sz w:val="24"/>
+              <w:szCs w:val="24"/>
+              <w:lang w:val="pt-BR" w:eastAsia="en-US" w:bidi="ar-SA"/>
+            </w:rPr>
+            <w:t>Notificação</w:t>
+          </w:r>
+        </w:p>
+        <w:p>
+          <w:pPr>
+            <w:pStyle w:val="Normal"/>
+            <w:widowControl/>
+            <w:suppressAutoHyphens w:val="true"/>
+            <w:spacing w:lineRule="auto" w:line="240" w:before="0" w:after="0"/>
+            <w:jc w:val="center"/>
+            <w:rPr>
+              <w:b/>
+              <w:bCs/>
+            </w:rPr>
+          </w:pPr>
+          <w:r>
+            <w:rPr>
+              <w:rFonts w:eastAsia="Aptos" w:cs=""/>
+              <w:b/>
+              <w:bCs/>
+              <w:kern w:val="2"/>
+              <w:sz w:val="24"/>
+              <w:szCs w:val="24"/>
+              <w:lang w:val="pt-BR" w:eastAsia="en-US" w:bidi="ar-SA"/>
+            </w:rPr>
+            <w:t>Realização de Perícia Técnica</w:t>
+          </w:r>
+        </w:p>
+      </w:tc>
+      <w:tc>
+        <w:tcPr>
+          <w:tcW w:w="2832" w:type="dxa"/>
+          <w:tcBorders/>
+        </w:tcPr>
+        <w:p>
+          <w:pPr>
+            <w:pStyle w:val="Normal"/>
+            <w:widowControl/>
+            <w:suppressAutoHyphens w:val="true"/>
+            <w:spacing w:lineRule="auto" w:line="240" w:before="0" w:after="0"/>
+            <w:jc w:val="left"/>
+            <w:rPr>
+              <w:rFonts w:ascii="Aptos" w:hAnsi="Aptos" w:eastAsia="Aptos" w:cs=""/>
+              <w:kern w:val="2"/>
+              <w:sz w:val="24"/>
+              <w:szCs w:val="24"/>
+              <w:lang w:val="pt-BR" w:eastAsia="en-US" w:bidi="ar-SA"/>
+            </w:rPr>
+          </w:pPr>
+          <w:r>
+            <w:rPr>
+              <w:rFonts w:eastAsia="Aptos" w:cs=""/>
+              <w:kern w:val="2"/>
+              <w:sz w:val="24"/>
+              <w:szCs w:val="24"/>
+              <w:lang w:val="pt-BR" w:eastAsia="en-US" w:bidi="ar-SA"/>
+            </w:rPr>
+          </w:r>
+        </w:p>
+      </w:tc>
+    </w:tr>
+  </w:tbl>
+  <w:p>
+    <w:pPr>
+      <w:pStyle w:val="Normal"/>
+      <w:spacing w:before="0" w:after="160"/>
+      <w:rPr/>
+    </w:pPr>
+    <w:r>
+      <w:rPr/>
+    </w:r>
+  </w:p>
+</w:hdr>
+</file>
+
+<file path=word/header3.xml><?xml version="1.0" encoding="utf-8"?>
+<w:hdr xmlns:o="urn:schemas-microsoft-com:office:office" xmlns:r="http://schemas.openxmlformats.org/officeDocument/2006/relationships" xmlns:v="urn:schemas-microsoft-com:vml" xmlns:w="http://schemas.openxmlformats.org/wordprocessingml/2006/main" xmlns:w10="urn:schemas-microsoft-com:office:word" xmlns:wp="http://schemas.openxmlformats.org/drawingml/2006/wordprocessingDrawing" xmlns:wps="http://schemas.microsoft.com/office/word/2010/wordprocessingShape" xmlns:wpg="http://schemas.microsoft.com/office/word/2010/wordprocessingGroup" xmlns:mc="http://schemas.openxmlformats.org/markup-compatibility/2006" xmlns:wp14="http://schemas.microsoft.com/office/word/2010/wordprocessingDrawing" xmlns:w14="http://schemas.microsoft.com/office/word/2010/wordml" xmlns:w15="http://schemas.microsoft.com/office/word/2012/wordml" mc:Ignorable="w14 wp14 w15">
+  <w:tbl>
+    <w:tblPr>
+      <w:tblStyle w:val="Tabelacomgrade"/>
+      <w:tblW w:w="8494" w:type="dxa"/>
+      <w:jc w:val="center"/>
+      <w:tblInd w:w="0" w:type="dxa"/>
+      <w:tblLayout w:type="fixed"/>
+      <w:tblCellMar>
+        <w:top w:w="0" w:type="dxa"/>
+        <w:left w:w="108" w:type="dxa"/>
+        <w:bottom w:w="0" w:type="dxa"/>
+        <w:right w:w="108" w:type="dxa"/>
+      </w:tblCellMar>
+      <w:tblLook w:val="04a0" w:noHBand="0" w:noVBand="1" w:firstColumn="1" w:lastRow="0" w:lastColumn="0" w:firstRow="1"/>
+    </w:tblPr>
+    <w:tblGrid>
+      <w:gridCol w:w="2831"/>
+      <w:gridCol w:w="2831"/>
+      <w:gridCol w:w="2832"/>
+    </w:tblGrid>
+    <w:tr>
+      <w:trPr>
+        <w:trHeight w:val="557" w:hRule="atLeast"/>
+      </w:trPr>
+      <w:tc>
+        <w:tcPr>
+          <w:tcW w:w="2831" w:type="dxa"/>
+          <w:tcBorders/>
+        </w:tcPr>
+        <w:p>
+          <w:pPr>
+            <w:pStyle w:val="Normal"/>
+            <w:widowControl/>
+            <w:suppressAutoHyphens w:val="true"/>
+            <w:spacing w:lineRule="auto" w:line="240" w:before="0" w:after="0"/>
+            <w:jc w:val="center"/>
+            <w:rPr>
+              <w:b/>
+              <w:bCs/>
+            </w:rPr>
+          </w:pPr>
+          <w:r>
+            <w:rPr>
+              <w:rFonts w:eastAsia="Aptos" w:cs=""/>
+              <w:b/>
+              <w:bCs/>
+              <w:kern w:val="2"/>
+              <w:sz w:val="24"/>
+              <w:szCs w:val="24"/>
+              <w:lang w:val="pt-BR" w:eastAsia="en-US" w:bidi="ar-SA"/>
+            </w:rPr>
+            <w:t>PROCESSO</w:t>
+          </w:r>
+        </w:p>
+        <w:p>
+          <w:pPr>
+            <w:pStyle w:val="Normal"/>
+            <w:widowControl/>
+            <w:suppressAutoHyphens w:val="true"/>
+            <w:spacing w:lineRule="auto" w:line="240" w:before="0" w:after="0"/>
+            <w:jc w:val="center"/>
+            <w:rPr>
+              <w:b/>
+              <w:bCs/>
+            </w:rPr>
+          </w:pPr>
+          <w:r>
+            <w:rPr>
+              <w:rFonts w:eastAsia="Aptos" w:cs=""/>
+              <w:b/>
+              <w:bCs/>
+              <w:kern w:val="2"/>
+              <w:sz w:val="24"/>
+              <w:szCs w:val="24"/>
+              <w:lang w:val="pt-BR" w:eastAsia="en-US" w:bidi="ar-SA"/>
+            </w:rPr>
+            <w:t>{{NumeroPericia}}</w:t>
+          </w:r>
+        </w:p>
+      </w:tc>
+      <w:tc>
+        <w:tcPr>
+          <w:tcW w:w="2831" w:type="dxa"/>
+          <w:tcBorders/>
+        </w:tcPr>
+        <w:p>
+          <w:pPr>
+            <w:pStyle w:val="Normal"/>
+            <w:widowControl/>
+            <w:suppressAutoHyphens w:val="true"/>
+            <w:spacing w:lineRule="auto" w:line="240" w:before="0" w:after="0"/>
+            <w:jc w:val="center"/>
+            <w:rPr>
+              <w:b/>
+              <w:bCs/>
+            </w:rPr>
+          </w:pPr>
+          <w:r>
+            <w:rPr>
+              <w:rFonts w:eastAsia="Aptos" w:cs=""/>
+              <w:b/>
+              <w:bCs/>
+              <w:kern w:val="2"/>
+              <w:sz w:val="24"/>
+              <w:szCs w:val="24"/>
+              <w:lang w:val="pt-BR" w:eastAsia="en-US" w:bidi="ar-SA"/>
+            </w:rPr>
+            <w:t>Notificação</w:t>
+          </w:r>
+        </w:p>
+        <w:p>
+          <w:pPr>
+            <w:pStyle w:val="Normal"/>
+            <w:widowControl/>
+            <w:suppressAutoHyphens w:val="true"/>
+            <w:spacing w:lineRule="auto" w:line="240" w:before="0" w:after="0"/>
+            <w:jc w:val="center"/>
+            <w:rPr>
+              <w:b/>
+              <w:bCs/>
+            </w:rPr>
+          </w:pPr>
+          <w:r>
+            <w:rPr>
+              <w:rFonts w:eastAsia="Aptos" w:cs=""/>
+              <w:b/>
+              <w:bCs/>
+              <w:kern w:val="2"/>
+              <w:sz w:val="24"/>
+              <w:szCs w:val="24"/>
+              <w:lang w:val="pt-BR" w:eastAsia="en-US" w:bidi="ar-SA"/>
+            </w:rPr>
+            <w:t>Realização de Perícia Técnica</w:t>
+          </w:r>
+        </w:p>
+      </w:tc>
+      <w:tc>
+        <w:tcPr>
+          <w:tcW w:w="2832" w:type="dxa"/>
+          <w:tcBorders/>
+        </w:tcPr>
+        <w:p>
+          <w:pPr>
+            <w:pStyle w:val="Normal"/>
+            <w:widowControl/>
+            <w:suppressAutoHyphens w:val="true"/>
+            <w:spacing w:lineRule="auto" w:line="240" w:before="0" w:after="0"/>
+            <w:jc w:val="left"/>
+            <w:rPr>
+              <w:rFonts w:ascii="Aptos" w:hAnsi="Aptos" w:eastAsia="Aptos" w:cs=""/>
+              <w:kern w:val="2"/>
+              <w:sz w:val="24"/>
+              <w:szCs w:val="24"/>
+              <w:lang w:val="pt-BR" w:eastAsia="en-US" w:bidi="ar-SA"/>
+            </w:rPr>
+          </w:pPr>
+          <w:r>
+            <w:rPr>
+              <w:rFonts w:eastAsia="Aptos" w:cs=""/>
+              <w:kern w:val="2"/>
+              <w:sz w:val="24"/>
+              <w:szCs w:val="24"/>
+              <w:lang w:val="pt-BR" w:eastAsia="en-US" w:bidi="ar-SA"/>
+            </w:rPr>
+          </w:r>
+        </w:p>
+      </w:tc>
+    </w:tr>
+  </w:tbl>
+  <w:p>
+    <w:pPr>
+      <w:pStyle w:val="Normal"/>
+      <w:spacing w:before="0" w:after="160"/>
+      <w:rPr/>
+    </w:pPr>
+    <w:r>
+      <w:rPr/>
+    </w:r>
+  </w:p>
+</w:hdr>
 </file>
 
 <file path=word/numbering.xml><?xml version="1.0" encoding="utf-8"?>
@@ -4899,6 +4018,13 @@
     <w:rsid w:val="007803a3"/>
     <w:rPr/>
   </w:style>
+  <w:style w:type="character" w:styleId="Marcadores">
+    <w:name w:val="Marcadores"/>
+    <w:qFormat/>
+    <w:rPr>
+      <w:rFonts w:ascii="OpenSymbol" w:hAnsi="OpenSymbol" w:eastAsia="OpenSymbol" w:cs="OpenSymbol"/>
+    </w:rPr>
+  </w:style>
   <w:style w:type="paragraph" w:styleId="Ttulo">
     <w:name w:val="Título"/>
     <w:basedOn w:val="Normal"/>
@@ -5113,6 +4239,29 @@
     <w:rPr>
       <w:rFonts w:ascii="Arial" w:hAnsi="Arial" w:cs="Arial"/>
       <w:b/>
+    </w:rPr>
+  </w:style>
+  <w:style w:type="paragraph" w:styleId="Contedodatabela">
+    <w:name w:val="Conteúdo da tabela"/>
+    <w:basedOn w:val="Normal"/>
+    <w:qFormat/>
+    <w:pPr>
+      <w:widowControl w:val="false"/>
+      <w:suppressLineNumbers/>
+    </w:pPr>
+    <w:rPr/>
+  </w:style>
+  <w:style w:type="paragraph" w:styleId="Ttulodetabela">
+    <w:name w:val="Título de tabela"/>
+    <w:basedOn w:val="Contedodatabela"/>
+    <w:qFormat/>
+    <w:pPr>
+      <w:suppressLineNumbers/>
+      <w:jc w:val="center"/>
+    </w:pPr>
+    <w:rPr>
+      <w:b/>
+      <w:bCs/>
     </w:rPr>
   </w:style>
   <w:style w:type="numbering" w:styleId="Semlista" w:default="1">

</xml_diff>